<commit_message>
Paired-down Compass speaker script for Elements 3-7
Rewrite the Word script for a non-Databricks audience: Home open, brief Element 2 inventory, then Ingestion through Export. Drop the clock, prompt map, catch-up, and Element 1 / live-deploy sections. Keep night-before prep.
</commit_message>
<xml_diff>
--- a/ONR_ITSS_Databricks_Speaker_Script.docx
+++ b/ONR_ITSS_Databricks_Speaker_Script.docx
@@ -31,7 +31,7 @@
           <w:color w:val="082B46"/>
           <w:sz w:val="52"/>
         </w:rPr>
-        <w:t>Databricks Speaker Script</w:t>
+        <w:t>Project Compass Speaker Script</w:t>
       </w:r>
     </w:p>
     <w:p>
@@ -47,7 +47,7 @@
           <w:color w:val="5B6B80"/>
           <w:sz w:val="24"/>
         </w:rPr>
-        <w:t>Project Compass  ·  Code 08 portfolio  ·  25 minutes or less</w:t>
+        <w:t>Code 08 portfolio  ·  Elements 3–7, with a brief Element 2 inventory</w:t>
       </w:r>
     </w:p>
     <w:p>
@@ -63,1299 +63,8 @@
           <w:color w:val="031522"/>
           <w:sz w:val="22"/>
         </w:rPr>
-        <w:t>One Key Personnel  ·  live cloud + live repo  ·  no slides  ·  no overlays</w:t>
+        <w:t>One Key Personnel  ·  live console  ·  no slides  ·  mock data only</w:t>
       </w:r>
-    </w:p>
-    <w:p>
-      <w:pPr>
-        <w:spacing w:before="320" w:after="120"/>
-        <w:pBdr>
-          <w:bottom w:val="single" w:sz="12" w:space="4" w:color="8C6A22"/>
-        </w:pBdr>
-      </w:pPr>
-      <w:r>
-        <w:rPr>
-          <w:rFonts w:ascii="Calibri" w:hAnsi="Calibri"/>
-          <w:b/>
-          <w:i w:val="0"/>
-          <w:color w:val="082B46"/>
-          <w:sz w:val="32"/>
-        </w:rPr>
-        <w:t>How to use this script</w:t>
-      </w:r>
-    </w:p>
-    <w:p>
-      <w:pPr>
-        <w:spacing w:after="160" w:before="0" w:line="276" w:lineRule="auto"/>
-      </w:pPr>
-      <w:r>
-        <w:rPr>
-          <w:rFonts w:ascii="Calibri" w:hAnsi="Calibri"/>
-          <w:b w:val="0"/>
-          <w:i w:val="0"/>
-          <w:color w:val="031522"/>
-          <w:sz w:val="22"/>
-        </w:rPr>
-        <w:t>This is the Databricks recording. A second 25-minute recording covers the AWS-native stack. Together they are the two-version demonstration. This file is Databricks only.</w:t>
-      </w:r>
-    </w:p>
-    <w:p>
-      <w:pPr>
-        <w:spacing w:after="160" w:before="0" w:line="276" w:lineRule="auto"/>
-      </w:pPr>
-      <w:r>
-        <w:rPr>
-          <w:rFonts w:ascii="Calibri" w:hAnsi="Calibri"/>
-          <w:b w:val="0"/>
-          <w:i w:val="0"/>
-          <w:color w:val="031522"/>
-          <w:sz w:val="22"/>
-        </w:rPr>
-        <w:t xml:space="preserve">Spoken lines </w:t>
-      </w:r>
-      <w:r>
-        <w:rPr>
-          <w:rFonts w:ascii="Calibri" w:hAnsi="Calibri"/>
-          <w:b w:val="0"/>
-          <w:i w:val="0"/>
-          <w:color w:val="031522"/>
-          <w:sz w:val="22"/>
-        </w:rPr>
-        <w:t>are in roman type. Read them. Do not paraphrase Element labels or the five strategic-prompt answers.</w:t>
-      </w:r>
-    </w:p>
-    <w:p>
-      <w:pPr>
-        <w:spacing w:after="160" w:before="0" w:line="276" w:lineRule="auto"/>
-      </w:pPr>
-      <w:r>
-        <w:rPr>
-          <w:rFonts w:ascii="Calibri" w:hAnsi="Calibri"/>
-          <w:b w:val="0"/>
-          <w:i w:val="0"/>
-          <w:color w:val="031522"/>
-          <w:sz w:val="22"/>
-        </w:rPr>
-        <w:t xml:space="preserve">Clicks </w:t>
-      </w:r>
-      <w:r>
-        <w:rPr>
-          <w:rFonts w:ascii="Calibri" w:hAnsi="Calibri"/>
-          <w:b w:val="0"/>
-          <w:i w:val="0"/>
-          <w:color w:val="031522"/>
-          <w:sz w:val="22"/>
-        </w:rPr>
-        <w:t xml:space="preserve">are in gold </w:t>
-      </w:r>
-      <w:r>
-        <w:rPr>
-          <w:rFonts w:ascii="Calibri" w:hAnsi="Calibri"/>
-          <w:b/>
-          <w:i/>
-          <w:color w:val="8C6A22"/>
-          <w:sz w:val="22"/>
-        </w:rPr>
-        <w:t>[DO THIS]</w:t>
-      </w:r>
-      <w:r>
-        <w:rPr>
-          <w:rFonts w:ascii="Calibri" w:hAnsi="Calibri"/>
-          <w:b w:val="0"/>
-          <w:i w:val="0"/>
-          <w:color w:val="031522"/>
-          <w:sz w:val="22"/>
-        </w:rPr>
-        <w:t xml:space="preserve"> boxes. Do the click, then keep reading. Do not stare at a spinner in silence.</w:t>
-      </w:r>
-    </w:p>
-    <w:p>
-      <w:pPr>
-        <w:spacing w:after="160" w:before="0" w:line="276" w:lineRule="auto"/>
-      </w:pPr>
-      <w:r>
-        <w:rPr>
-          <w:rFonts w:ascii="Calibri" w:hAnsi="Calibri"/>
-          <w:b w:val="0"/>
-          <w:i w:val="0"/>
-          <w:color w:val="031522"/>
-          <w:sz w:val="22"/>
-        </w:rPr>
-        <w:t>Clock marks are the latest you should still be on that beat. If you are late, jump to the Catch-up table. Pace is about 140 words per minute.</w:t>
-      </w:r>
-    </w:p>
-    <w:p>
-      <w:pPr>
-        <w:spacing w:after="160" w:before="0" w:line="276" w:lineRule="auto"/>
-      </w:pPr>
-      <w:r>
-        <w:rPr>
-          <w:rFonts w:ascii="Calibri" w:hAnsi="Calibri"/>
-          <w:b w:val="0"/>
-          <w:i w:val="0"/>
-          <w:color w:val="031522"/>
-          <w:sz w:val="22"/>
-        </w:rPr>
-        <w:t>Forward only. One Compass window after you enter the app. Do not Restore baseline. Do not retrain 04 or 04b. Do not unpause file-arrival. Do not invent an MFA form or a Deploy button inside Compass.</w:t>
-      </w:r>
-    </w:p>
-    <w:p>
-      <w:pPr>
-        <w:spacing w:before="320" w:after="120"/>
-        <w:pBdr>
-          <w:bottom w:val="single" w:sz="12" w:space="4" w:color="8C6A22"/>
-        </w:pBdr>
-      </w:pPr>
-      <w:r>
-        <w:rPr>
-          <w:rFonts w:ascii="Calibri" w:hAnsi="Calibri"/>
-          <w:b/>
-          <w:i w:val="0"/>
-          <w:color w:val="082B46"/>
-          <w:sz w:val="32"/>
-        </w:rPr>
-        <w:t>25-minute clock</w:t>
-      </w:r>
-    </w:p>
-    <w:tbl>
-      <w:tblPr>
-        <w:tblStyle w:val="TableGrid"/>
-        <w:tblW w:type="auto" w:w="0"/>
-        <w:jc w:val="center"/>
-        <w:tblLook w:firstColumn="1" w:firstRow="1" w:lastColumn="0" w:lastRow="0" w:noHBand="0" w:noVBand="1" w:val="04A0"/>
-      </w:tblPr>
-      <w:tblGrid>
-        <w:gridCol w:w="2412"/>
-        <w:gridCol w:w="2412"/>
-        <w:gridCol w:w="2412"/>
-        <w:gridCol w:w="2412"/>
-      </w:tblGrid>
-      <w:tr>
-        <w:tc>
-          <w:tcPr>
-            <w:tcW w:type="dxa" w:w="1656"/>
-            <w:shd w:fill="082B46" w:val="clear"/>
-          </w:tcPr>
-          <w:p>
-            <w:r/>
-            <w:r>
-              <w:rPr>
-                <w:rFonts w:ascii="Calibri" w:hAnsi="Calibri"/>
-                <w:b/>
-                <w:i w:val="0"/>
-                <w:color w:val="FFFFFF"/>
-                <w:sz w:val="20"/>
-              </w:rPr>
-              <w:t>Clock</w:t>
-            </w:r>
-          </w:p>
-        </w:tc>
-        <w:tc>
-          <w:tcPr>
-            <w:tcW w:type="dxa" w:w="2448"/>
-            <w:shd w:fill="082B46" w:val="clear"/>
-          </w:tcPr>
-          <w:p>
-            <w:r/>
-            <w:r>
-              <w:rPr>
-                <w:rFonts w:ascii="Calibri" w:hAnsi="Calibri"/>
-                <w:b/>
-                <w:i w:val="0"/>
-                <w:color w:val="FFFFFF"/>
-                <w:sz w:val="20"/>
-              </w:rPr>
-              <w:t>Where</w:t>
-            </w:r>
-          </w:p>
-        </w:tc>
-        <w:tc>
-          <w:tcPr>
-            <w:tcW w:type="dxa" w:w="3096"/>
-            <w:shd w:fill="082B46" w:val="clear"/>
-          </w:tcPr>
-          <w:p>
-            <w:r/>
-            <w:r>
-              <w:rPr>
-                <w:rFonts w:ascii="Calibri" w:hAnsi="Calibri"/>
-                <w:b/>
-                <w:i w:val="0"/>
-                <w:color w:val="FFFFFF"/>
-                <w:sz w:val="20"/>
-              </w:rPr>
-              <w:t>Live action</w:t>
-            </w:r>
-          </w:p>
-        </w:tc>
-        <w:tc>
-          <w:tcPr>
-            <w:tcW w:type="dxa" w:w="2736"/>
-            <w:shd w:fill="082B46" w:val="clear"/>
-          </w:tcPr>
-          <w:p>
-            <w:r/>
-            <w:r>
-              <w:rPr>
-                <w:rFonts w:ascii="Calibri" w:hAnsi="Calibri"/>
-                <w:b/>
-                <w:i w:val="0"/>
-                <w:color w:val="FFFFFF"/>
-                <w:sz w:val="20"/>
-              </w:rPr>
-              <w:t>Must say</w:t>
-            </w:r>
-          </w:p>
-        </w:tc>
-      </w:tr>
-      <w:tr>
-        <w:tc>
-          <w:tcPr>
-            <w:tcW w:type="dxa" w:w="1656"/>
-          </w:tcPr>
-          <w:p>
-            <w:r/>
-            <w:r>
-              <w:rPr>
-                <w:rFonts w:ascii="Calibri" w:hAnsi="Calibri"/>
-                <w:b/>
-                <w:i w:val="0"/>
-                <w:color w:val="031522"/>
-                <w:sz w:val="20"/>
-              </w:rPr>
-              <w:t>0:00–2:00</w:t>
-            </w:r>
-          </w:p>
-        </w:tc>
-        <w:tc>
-          <w:tcPr>
-            <w:tcW w:type="dxa" w:w="2448"/>
-          </w:tcPr>
-          <w:p>
-            <w:r/>
-            <w:r>
-              <w:rPr>
-                <w:rFonts w:ascii="Calibri" w:hAnsi="Calibri"/>
-                <w:b w:val="0"/>
-                <w:i w:val="0"/>
-                <w:color w:val="031522"/>
-                <w:sz w:val="20"/>
-              </w:rPr>
-              <w:t>BEFORE Compass</w:t>
-              <w:br/>
-              <w:t>IdP / workspace login</w:t>
-            </w:r>
-          </w:p>
-        </w:tc>
-        <w:tc>
-          <w:tcPr>
-            <w:tcW w:type="dxa" w:w="3096"/>
-          </w:tcPr>
-          <w:p>
-            <w:r/>
-            <w:r>
-              <w:rPr>
-                <w:rFonts w:ascii="Calibri" w:hAnsi="Calibri"/>
-                <w:b w:val="0"/>
-                <w:i w:val="0"/>
-                <w:color w:val="031522"/>
-                <w:sz w:val="20"/>
-              </w:rPr>
-              <w:t>Live MFA at the identity provider</w:t>
-            </w:r>
-          </w:p>
-        </w:tc>
-        <w:tc>
-          <w:tcPr>
-            <w:tcW w:type="dxa" w:w="2736"/>
-          </w:tcPr>
-          <w:p>
-            <w:r/>
-            <w:r>
-              <w:rPr>
-                <w:rFonts w:ascii="Calibri" w:hAnsi="Calibri"/>
-                <w:b w:val="0"/>
-                <w:i w:val="0"/>
-                <w:color w:val="031522"/>
-                <w:sz w:val="20"/>
-              </w:rPr>
-              <w:t>Element 1  ·  Zero Trust  ·  least privilege</w:t>
-            </w:r>
-          </w:p>
-        </w:tc>
-      </w:tr>
-      <w:tr>
-        <w:tc>
-          <w:tcPr>
-            <w:tcW w:type="dxa" w:w="1656"/>
-            <w:shd w:fill="E7EFF4" w:val="clear"/>
-          </w:tcPr>
-          <w:p>
-            <w:r/>
-            <w:r>
-              <w:rPr>
-                <w:rFonts w:ascii="Calibri" w:hAnsi="Calibri"/>
-                <w:b/>
-                <w:i w:val="0"/>
-                <w:color w:val="031522"/>
-                <w:sz w:val="20"/>
-              </w:rPr>
-              <w:t>2:00–4:00</w:t>
-            </w:r>
-          </w:p>
-        </w:tc>
-        <w:tc>
-          <w:tcPr>
-            <w:tcW w:type="dxa" w:w="2448"/>
-            <w:shd w:fill="E7EFF4" w:val="clear"/>
-          </w:tcPr>
-          <w:p>
-            <w:r/>
-            <w:r>
-              <w:rPr>
-                <w:rFonts w:ascii="Calibri" w:hAnsi="Calibri"/>
-                <w:b w:val="0"/>
-                <w:i w:val="0"/>
-                <w:color w:val="031522"/>
-                <w:sz w:val="20"/>
-              </w:rPr>
-              <w:t>BEFORE Compass</w:t>
-              <w:br/>
-              <w:t>GitHub + terminal</w:t>
-            </w:r>
-          </w:p>
-        </w:tc>
-        <w:tc>
-          <w:tcPr>
-            <w:tcW w:type="dxa" w:w="3096"/>
-            <w:shd w:fill="E7EFF4" w:val="clear"/>
-          </w:tcPr>
-          <w:p>
-            <w:r/>
-            <w:r>
-              <w:rPr>
-                <w:rFonts w:ascii="Calibri" w:hAnsi="Calibri"/>
-                <w:b w:val="0"/>
-                <w:i w:val="0"/>
-                <w:color w:val="031522"/>
-                <w:sz w:val="20"/>
-              </w:rPr>
-              <w:t>Show databricks.yml  ·  databricks bundle deploy -t poc</w:t>
-            </w:r>
-          </w:p>
-        </w:tc>
-        <w:tc>
-          <w:tcPr>
-            <w:tcW w:type="dxa" w:w="2736"/>
-            <w:shd w:fill="E7EFF4" w:val="clear"/>
-          </w:tcPr>
-          <w:p>
-            <w:r/>
-            <w:r>
-              <w:rPr>
-                <w:rFonts w:ascii="Calibri" w:hAnsi="Calibri"/>
-                <w:b w:val="0"/>
-                <w:i w:val="0"/>
-                <w:color w:val="031522"/>
-                <w:sz w:val="20"/>
-              </w:rPr>
-              <w:t>Element 2  ·  most of IaC / CI-CD</w:t>
-            </w:r>
-          </w:p>
-        </w:tc>
-      </w:tr>
-      <w:tr>
-        <w:tc>
-          <w:tcPr>
-            <w:tcW w:type="dxa" w:w="1656"/>
-          </w:tcPr>
-          <w:p>
-            <w:r/>
-            <w:r>
-              <w:rPr>
-                <w:rFonts w:ascii="Calibri" w:hAnsi="Calibri"/>
-                <w:b/>
-                <w:i w:val="0"/>
-                <w:color w:val="031522"/>
-                <w:sz w:val="20"/>
-              </w:rPr>
-              <w:t>4:00–4:40</w:t>
-            </w:r>
-          </w:p>
-        </w:tc>
-        <w:tc>
-          <w:tcPr>
-            <w:tcW w:type="dxa" w:w="2448"/>
-          </w:tcPr>
-          <w:p>
-            <w:r/>
-            <w:r>
-              <w:rPr>
-                <w:rFonts w:ascii="Calibri" w:hAnsi="Calibri"/>
-                <w:b w:val="0"/>
-                <w:i w:val="0"/>
-                <w:color w:val="031522"/>
-                <w:sz w:val="20"/>
-              </w:rPr>
-              <w:t>Compass → Infrastructure</w:t>
-            </w:r>
-          </w:p>
-        </w:tc>
-        <w:tc>
-          <w:tcPr>
-            <w:tcW w:type="dxa" w:w="3096"/>
-          </w:tcPr>
-          <w:p>
-            <w:r/>
-            <w:r>
-              <w:rPr>
-                <w:rFonts w:ascii="Calibri" w:hAnsi="Calibri"/>
-                <w:b w:val="0"/>
-                <w:i w:val="0"/>
-                <w:color w:val="031522"/>
-                <w:sz w:val="20"/>
-              </w:rPr>
-              <w:t>Point at Estate tiles</w:t>
-            </w:r>
-          </w:p>
-        </w:tc>
-        <w:tc>
-          <w:tcPr>
-            <w:tcW w:type="dxa" w:w="2736"/>
-          </w:tcPr>
-          <w:p>
-            <w:r/>
-            <w:r>
-              <w:rPr>
-                <w:rFonts w:ascii="Calibri" w:hAnsi="Calibri"/>
-                <w:b w:val="0"/>
-                <w:i w:val="0"/>
-                <w:color w:val="031522"/>
-                <w:sz w:val="20"/>
-              </w:rPr>
-              <w:t>Element 2 remainder  ·  inventory of that deploy</w:t>
-            </w:r>
-          </w:p>
-        </w:tc>
-      </w:tr>
-      <w:tr>
-        <w:tc>
-          <w:tcPr>
-            <w:tcW w:type="dxa" w:w="1656"/>
-            <w:shd w:fill="E7EFF4" w:val="clear"/>
-          </w:tcPr>
-          <w:p>
-            <w:r/>
-            <w:r>
-              <w:rPr>
-                <w:rFonts w:ascii="Calibri" w:hAnsi="Calibri"/>
-                <w:b/>
-                <w:i w:val="0"/>
-                <w:color w:val="031522"/>
-                <w:sz w:val="20"/>
-              </w:rPr>
-              <w:t>4:40–10:30</w:t>
-            </w:r>
-          </w:p>
-        </w:tc>
-        <w:tc>
-          <w:tcPr>
-            <w:tcW w:type="dxa" w:w="2448"/>
-            <w:shd w:fill="E7EFF4" w:val="clear"/>
-          </w:tcPr>
-          <w:p>
-            <w:r/>
-            <w:r>
-              <w:rPr>
-                <w:rFonts w:ascii="Calibri" w:hAnsi="Calibri"/>
-                <w:b w:val="0"/>
-                <w:i w:val="0"/>
-                <w:color w:val="031522"/>
-                <w:sz w:val="20"/>
-              </w:rPr>
-              <w:t>Ingestion</w:t>
-            </w:r>
-          </w:p>
-        </w:tc>
-        <w:tc>
-          <w:tcPr>
-            <w:tcW w:type="dxa" w:w="3096"/>
-            <w:shd w:fill="E7EFF4" w:val="clear"/>
-          </w:tcPr>
-          <w:p>
-            <w:r/>
-            <w:r>
-              <w:rPr>
-                <w:rFonts w:ascii="Calibri" w:hAnsi="Calibri"/>
-                <w:b w:val="0"/>
-                <w:i w:val="0"/>
-                <w:color w:val="031522"/>
-                <w:sz w:val="20"/>
-              </w:rPr>
-              <w:t>Ingest selected files  →  Hold  →  Start stream</w:t>
-            </w:r>
-          </w:p>
-        </w:tc>
-        <w:tc>
-          <w:tcPr>
-            <w:tcW w:type="dxa" w:w="2736"/>
-            <w:shd w:fill="E7EFF4" w:val="clear"/>
-          </w:tcPr>
-          <w:p>
-            <w:r/>
-            <w:r>
-              <w:rPr>
-                <w:rFonts w:ascii="Calibri" w:hAnsi="Calibri"/>
-                <w:b w:val="0"/>
-                <w:i w:val="0"/>
-                <w:color w:val="031522"/>
-                <w:sz w:val="20"/>
-              </w:rPr>
-              <w:t>Element 3  ·  (a)  ·  (d)  ·  400→408</w:t>
-            </w:r>
-          </w:p>
-        </w:tc>
-      </w:tr>
-      <w:tr>
-        <w:tc>
-          <w:tcPr>
-            <w:tcW w:type="dxa" w:w="1656"/>
-          </w:tcPr>
-          <w:p>
-            <w:r/>
-            <w:r>
-              <w:rPr>
-                <w:rFonts w:ascii="Calibri" w:hAnsi="Calibri"/>
-                <w:b/>
-                <w:i w:val="0"/>
-                <w:color w:val="031522"/>
-                <w:sz w:val="20"/>
-              </w:rPr>
-              <w:t>10:30–13:00</w:t>
-            </w:r>
-          </w:p>
-        </w:tc>
-        <w:tc>
-          <w:tcPr>
-            <w:tcW w:type="dxa" w:w="2448"/>
-          </w:tcPr>
-          <w:p>
-            <w:r/>
-            <w:r>
-              <w:rPr>
-                <w:rFonts w:ascii="Calibri" w:hAnsi="Calibri"/>
-                <w:b w:val="0"/>
-                <w:i w:val="0"/>
-                <w:color w:val="031522"/>
-                <w:sz w:val="20"/>
-              </w:rPr>
-              <w:t>Catalog</w:t>
-            </w:r>
-          </w:p>
-        </w:tc>
-        <w:tc>
-          <w:tcPr>
-            <w:tcW w:type="dxa" w:w="3096"/>
-          </w:tcPr>
-          <w:p>
-            <w:r/>
-            <w:r>
-              <w:rPr>
-                <w:rFonts w:ascii="Calibri" w:hAnsi="Calibri"/>
-                <w:b w:val="0"/>
-                <w:i w:val="0"/>
-                <w:color w:val="031522"/>
-                <w:sz w:val="20"/>
-              </w:rPr>
-              <w:t>Open lineage  ·  Registry  ·  Quality  ·  tags</w:t>
-            </w:r>
-          </w:p>
-        </w:tc>
-        <w:tc>
-          <w:tcPr>
-            <w:tcW w:type="dxa" w:w="2736"/>
-          </w:tcPr>
-          <w:p>
-            <w:r/>
-            <w:r>
-              <w:rPr>
-                <w:rFonts w:ascii="Calibri" w:hAnsi="Calibri"/>
-                <w:b w:val="0"/>
-                <w:i w:val="0"/>
-                <w:color w:val="031522"/>
-                <w:sz w:val="20"/>
-              </w:rPr>
-              <w:t>Element 4  ·  (e)</w:t>
-            </w:r>
-          </w:p>
-        </w:tc>
-      </w:tr>
-      <w:tr>
-        <w:tc>
-          <w:tcPr>
-            <w:tcW w:type="dxa" w:w="1656"/>
-            <w:shd w:fill="E7EFF4" w:val="clear"/>
-          </w:tcPr>
-          <w:p>
-            <w:r/>
-            <w:r>
-              <w:rPr>
-                <w:rFonts w:ascii="Calibri" w:hAnsi="Calibri"/>
-                <w:b/>
-                <w:i w:val="0"/>
-                <w:color w:val="031522"/>
-                <w:sz w:val="20"/>
-              </w:rPr>
-              <w:t>13:00–18:00</w:t>
-            </w:r>
-          </w:p>
-        </w:tc>
-        <w:tc>
-          <w:tcPr>
-            <w:tcW w:type="dxa" w:w="2448"/>
-            <w:shd w:fill="E7EFF4" w:val="clear"/>
-          </w:tcPr>
-          <w:p>
-            <w:r/>
-            <w:r>
-              <w:rPr>
-                <w:rFonts w:ascii="Calibri" w:hAnsi="Calibri"/>
-                <w:b w:val="0"/>
-                <w:i w:val="0"/>
-                <w:color w:val="031522"/>
-                <w:sz w:val="20"/>
-              </w:rPr>
-              <w:t>Analytics</w:t>
-            </w:r>
-          </w:p>
-        </w:tc>
-        <w:tc>
-          <w:tcPr>
-            <w:tcW w:type="dxa" w:w="3096"/>
-            <w:shd w:fill="E7EFF4" w:val="clear"/>
-          </w:tcPr>
-          <w:p>
-            <w:r/>
-            <w:r>
-              <w:rPr>
-                <w:rFonts w:ascii="Calibri" w:hAnsi="Calibri"/>
-                <w:b w:val="0"/>
-                <w:i w:val="0"/>
-                <w:color w:val="031522"/>
-                <w:sz w:val="20"/>
-              </w:rPr>
-              <w:t>Score registered models  ·  Scores  ·  Drift</w:t>
-            </w:r>
-          </w:p>
-        </w:tc>
-        <w:tc>
-          <w:tcPr>
-            <w:tcW w:type="dxa" w:w="2736"/>
-            <w:shd w:fill="E7EFF4" w:val="clear"/>
-          </w:tcPr>
-          <w:p>
-            <w:r/>
-            <w:r>
-              <w:rPr>
-                <w:rFonts w:ascii="Calibri" w:hAnsi="Calibri"/>
-                <w:b w:val="0"/>
-                <w:i w:val="0"/>
-                <w:color w:val="031522"/>
-                <w:sz w:val="20"/>
-              </w:rPr>
-              <w:t>Element 5  ·  (b)</w:t>
-            </w:r>
-          </w:p>
-        </w:tc>
-      </w:tr>
-      <w:tr>
-        <w:tc>
-          <w:tcPr>
-            <w:tcW w:type="dxa" w:w="1656"/>
-          </w:tcPr>
-          <w:p>
-            <w:r/>
-            <w:r>
-              <w:rPr>
-                <w:rFonts w:ascii="Calibri" w:hAnsi="Calibri"/>
-                <w:b/>
-                <w:i w:val="0"/>
-                <w:color w:val="031522"/>
-                <w:sz w:val="20"/>
-              </w:rPr>
-              <w:t>18:00–20:30</w:t>
-            </w:r>
-          </w:p>
-        </w:tc>
-        <w:tc>
-          <w:tcPr>
-            <w:tcW w:type="dxa" w:w="2448"/>
-          </w:tcPr>
-          <w:p>
-            <w:r/>
-            <w:r>
-              <w:rPr>
-                <w:rFonts w:ascii="Calibri" w:hAnsi="Calibri"/>
-                <w:b w:val="0"/>
-                <w:i w:val="0"/>
-                <w:color w:val="031522"/>
-                <w:sz w:val="20"/>
-              </w:rPr>
-              <w:t>Portfolio</w:t>
-            </w:r>
-          </w:p>
-        </w:tc>
-        <w:tc>
-          <w:tcPr>
-            <w:tcW w:type="dxa" w:w="3096"/>
-          </w:tcPr>
-          <w:p>
-            <w:r/>
-            <w:r>
-              <w:rPr>
-                <w:rFonts w:ascii="Calibri" w:hAnsi="Calibri"/>
-                <w:b w:val="0"/>
-                <w:i w:val="0"/>
-                <w:color w:val="031522"/>
-                <w:sz w:val="20"/>
-              </w:rPr>
-              <w:t>Search quantum  ·  Accept/Defer  ·  daily brief</w:t>
-            </w:r>
-          </w:p>
-        </w:tc>
-        <w:tc>
-          <w:tcPr>
-            <w:tcW w:type="dxa" w:w="2736"/>
-          </w:tcPr>
-          <w:p>
-            <w:r/>
-            <w:r>
-              <w:rPr>
-                <w:rFonts w:ascii="Calibri" w:hAnsi="Calibri"/>
-                <w:b w:val="0"/>
-                <w:i w:val="0"/>
-                <w:color w:val="031522"/>
-                <w:sz w:val="20"/>
-              </w:rPr>
-              <w:t>Element 6</w:t>
-            </w:r>
-          </w:p>
-        </w:tc>
-      </w:tr>
-      <w:tr>
-        <w:tc>
-          <w:tcPr>
-            <w:tcW w:type="dxa" w:w="1656"/>
-            <w:shd w:fill="E7EFF4" w:val="clear"/>
-          </w:tcPr>
-          <w:p>
-            <w:r/>
-            <w:r>
-              <w:rPr>
-                <w:rFonts w:ascii="Calibri" w:hAnsi="Calibri"/>
-                <w:b/>
-                <w:i w:val="0"/>
-                <w:color w:val="031522"/>
-                <w:sz w:val="20"/>
-              </w:rPr>
-              <w:t>20:30–25:00</w:t>
-            </w:r>
-          </w:p>
-        </w:tc>
-        <w:tc>
-          <w:tcPr>
-            <w:tcW w:type="dxa" w:w="2448"/>
-            <w:shd w:fill="E7EFF4" w:val="clear"/>
-          </w:tcPr>
-          <w:p>
-            <w:r/>
-            <w:r>
-              <w:rPr>
-                <w:rFonts w:ascii="Calibri" w:hAnsi="Calibri"/>
-                <w:b w:val="0"/>
-                <w:i w:val="0"/>
-                <w:color w:val="031522"/>
-                <w:sz w:val="20"/>
-              </w:rPr>
-              <w:t>Export</w:t>
-            </w:r>
-          </w:p>
-        </w:tc>
-        <w:tc>
-          <w:tcPr>
-            <w:tcW w:type="dxa" w:w="3096"/>
-            <w:shd w:fill="E7EFF4" w:val="clear"/>
-          </w:tcPr>
-          <w:p>
-            <w:r/>
-            <w:r>
-              <w:rPr>
-                <w:rFonts w:ascii="Calibri" w:hAnsi="Calibri"/>
-                <w:b w:val="0"/>
-                <w:i w:val="0"/>
-                <w:color w:val="031522"/>
-                <w:sz w:val="20"/>
-              </w:rPr>
-              <w:t>Execute export  ·  Statement API</w:t>
-            </w:r>
-          </w:p>
-        </w:tc>
-        <w:tc>
-          <w:tcPr>
-            <w:tcW w:type="dxa" w:w="2736"/>
-            <w:shd w:fill="E7EFF4" w:val="clear"/>
-          </w:tcPr>
-          <w:p>
-            <w:r/>
-            <w:r>
-              <w:rPr>
-                <w:rFonts w:ascii="Calibri" w:hAnsi="Calibri"/>
-                <w:b w:val="0"/>
-                <w:i w:val="0"/>
-                <w:color w:val="031522"/>
-                <w:sz w:val="20"/>
-              </w:rPr>
-              <w:t>Element 7  ·  (c)</w:t>
-            </w:r>
-          </w:p>
-        </w:tc>
-      </w:tr>
-    </w:tbl>
-    <w:p>
-      <w:pPr>
-        <w:spacing w:after="160"/>
-      </w:pPr>
-    </w:p>
-    <w:p>
-      <w:pPr>
-        <w:spacing w:after="160" w:before="0" w:line="276" w:lineRule="auto"/>
-      </w:pPr>
-      <w:r>
-        <w:rPr>
-          <w:rFonts w:ascii="Calibri" w:hAnsi="Calibri"/>
-          <w:b/>
-          <w:i w:val="0"/>
-          <w:color w:val="031522"/>
-          <w:sz w:val="22"/>
-        </w:rPr>
-        <w:t xml:space="preserve">Never cut: </w:t>
-      </w:r>
-      <w:r>
-        <w:rPr>
-          <w:rFonts w:ascii="Calibri" w:hAnsi="Calibri"/>
-          <w:b w:val="0"/>
-          <w:i w:val="0"/>
-          <w:color w:val="031522"/>
-          <w:sz w:val="22"/>
-        </w:rPr>
-        <w:t>live MFA before the app, live repo/bundle before the app, Estate, 400→408, Hold, stream heartbeat, Catalog Explorer lineage, Score, search, Statement API, all five prompts.</w:t>
-      </w:r>
-    </w:p>
-    <w:p>
-      <w:pPr>
-        <w:spacing w:after="160" w:before="0" w:line="276" w:lineRule="auto"/>
-      </w:pPr>
-      <w:r>
-        <w:rPr>
-          <w:rFonts w:ascii="Calibri" w:hAnsi="Calibri"/>
-          <w:b/>
-          <w:i w:val="0"/>
-          <w:color w:val="031522"/>
-          <w:sz w:val="22"/>
-        </w:rPr>
-        <w:t xml:space="preserve">Cut first if late: </w:t>
-      </w:r>
-      <w:r>
-        <w:rPr>
-          <w:rFonts w:ascii="Calibri" w:hAnsi="Calibri"/>
-          <w:b w:val="0"/>
-          <w:i w:val="0"/>
-          <w:color w:val="031522"/>
-          <w:sz w:val="22"/>
-        </w:rPr>
-        <w:t>Quality tab, Policies tab, Anomalies or Forecast (keep one), Budget tab, download.</w:t>
-      </w:r>
-    </w:p>
-    <w:p>
-      <w:pPr>
-        <w:spacing w:before="320" w:after="120"/>
-        <w:pBdr>
-          <w:bottom w:val="single" w:sz="12" w:space="4" w:color="8C6A22"/>
-        </w:pBdr>
-      </w:pPr>
-      <w:r>
-        <w:rPr>
-          <w:rFonts w:ascii="Calibri" w:hAnsi="Calibri"/>
-          <w:b/>
-          <w:i w:val="0"/>
-          <w:color w:val="082B46"/>
-          <w:sz w:val="32"/>
-        </w:rPr>
-        <w:t>Prompt map — say the letter out loud</w:t>
-      </w:r>
-    </w:p>
-    <w:tbl>
-      <w:tblPr>
-        <w:tblStyle w:val="TableGrid"/>
-        <w:tblW w:type="auto" w:w="0"/>
-        <w:jc w:val="center"/>
-        <w:tblLook w:firstColumn="1" w:firstRow="1" w:lastColumn="0" w:lastRow="0" w:noHBand="0" w:noVBand="1" w:val="04A0"/>
-      </w:tblPr>
-      <w:tblGrid>
-        <w:gridCol w:w="3216"/>
-        <w:gridCol w:w="3216"/>
-        <w:gridCol w:w="3216"/>
-      </w:tblGrid>
-      <w:tr>
-        <w:tc>
-          <w:tcPr>
-            <w:tcW w:type="dxa" w:w="2304"/>
-            <w:shd w:fill="082B46" w:val="clear"/>
-          </w:tcPr>
-          <w:p>
-            <w:r/>
-            <w:r>
-              <w:rPr>
-                <w:rFonts w:ascii="Calibri" w:hAnsi="Calibri"/>
-                <w:b/>
-                <w:i w:val="0"/>
-                <w:color w:val="FFFFFF"/>
-                <w:sz w:val="20"/>
-              </w:rPr>
-              <w:t>Prompt</w:t>
-            </w:r>
-          </w:p>
-        </w:tc>
-        <w:tc>
-          <w:tcPr>
-            <w:tcW w:type="dxa" w:w="2160"/>
-            <w:shd w:fill="082B46" w:val="clear"/>
-          </w:tcPr>
-          <w:p>
-            <w:r/>
-            <w:r>
-              <w:rPr>
-                <w:rFonts w:ascii="Calibri" w:hAnsi="Calibri"/>
-                <w:b/>
-                <w:i w:val="0"/>
-                <w:color w:val="FFFFFF"/>
-                <w:sz w:val="20"/>
-              </w:rPr>
-              <w:t>When</w:t>
-            </w:r>
-          </w:p>
-        </w:tc>
-        <w:tc>
-          <w:tcPr>
-            <w:tcW w:type="dxa" w:w="5472"/>
-            <w:shd w:fill="082B46" w:val="clear"/>
-          </w:tcPr>
-          <w:p>
-            <w:r/>
-            <w:r>
-              <w:rPr>
-                <w:rFonts w:ascii="Calibri" w:hAnsi="Calibri"/>
-                <w:b/>
-                <w:i w:val="0"/>
-                <w:color w:val="FFFFFF"/>
-                <w:sz w:val="20"/>
-              </w:rPr>
-              <w:t>One-line answer on this tape</w:t>
-            </w:r>
-          </w:p>
-        </w:tc>
-      </w:tr>
-      <w:tr>
-        <w:tc>
-          <w:tcPr>
-            <w:tcW w:type="dxa" w:w="2304"/>
-          </w:tcPr>
-          <w:p>
-            <w:r/>
-            <w:r>
-              <w:rPr>
-                <w:rFonts w:ascii="Calibri" w:hAnsi="Calibri"/>
-                <w:b/>
-                <w:i w:val="0"/>
-                <w:color w:val="031522"/>
-                <w:sz w:val="20"/>
-              </w:rPr>
-              <w:t>(a) Legacy footprint</w:t>
-            </w:r>
-          </w:p>
-        </w:tc>
-        <w:tc>
-          <w:tcPr>
-            <w:tcW w:type="dxa" w:w="2160"/>
-          </w:tcPr>
-          <w:p>
-            <w:r/>
-            <w:r>
-              <w:rPr>
-                <w:rFonts w:ascii="Calibri" w:hAnsi="Calibri"/>
-                <w:b w:val="0"/>
-                <w:i w:val="0"/>
-                <w:color w:val="031522"/>
-                <w:sz w:val="20"/>
-              </w:rPr>
-              <w:t>During Ingest</w:t>
-            </w:r>
-          </w:p>
-        </w:tc>
-        <w:tc>
-          <w:tcPr>
-            <w:tcW w:type="dxa" w:w="5472"/>
-          </w:tcPr>
-          <w:p>
-            <w:r/>
-            <w:r>
-              <w:rPr>
-                <w:rFonts w:ascii="Calibri" w:hAnsi="Calibri"/>
-                <w:b w:val="0"/>
-                <w:i w:val="0"/>
-                <w:color w:val="031522"/>
-                <w:sz w:val="20"/>
-              </w:rPr>
-              <w:t>Strangler-fig. Same bronze. Volume landing. Rollback = delete-the-batch.</w:t>
-            </w:r>
-          </w:p>
-        </w:tc>
-      </w:tr>
-      <w:tr>
-        <w:tc>
-          <w:tcPr>
-            <w:tcW w:type="dxa" w:w="2304"/>
-            <w:shd w:fill="E7EFF4" w:val="clear"/>
-          </w:tcPr>
-          <w:p>
-            <w:r/>
-            <w:r>
-              <w:rPr>
-                <w:rFonts w:ascii="Calibri" w:hAnsi="Calibri"/>
-                <w:b/>
-                <w:i w:val="0"/>
-                <w:color w:val="031522"/>
-                <w:sz w:val="20"/>
-              </w:rPr>
-              <w:t>(b) Financial / budget</w:t>
-            </w:r>
-          </w:p>
-        </w:tc>
-        <w:tc>
-          <w:tcPr>
-            <w:tcW w:type="dxa" w:w="2160"/>
-            <w:shd w:fill="E7EFF4" w:val="clear"/>
-          </w:tcPr>
-          <w:p>
-            <w:r/>
-            <w:r>
-              <w:rPr>
-                <w:rFonts w:ascii="Calibri" w:hAnsi="Calibri"/>
-                <w:b w:val="0"/>
-                <w:i w:val="0"/>
-                <w:color w:val="031522"/>
-                <w:sz w:val="20"/>
-              </w:rPr>
-              <w:t>During Score</w:t>
-            </w:r>
-          </w:p>
-        </w:tc>
-        <w:tc>
-          <w:tcPr>
-            <w:tcW w:type="dxa" w:w="5472"/>
-            <w:shd w:fill="E7EFF4" w:val="clear"/>
-          </w:tcPr>
-          <w:p>
-            <w:r/>
-            <w:r>
-              <w:rPr>
-                <w:rFonts w:ascii="Calibri" w:hAnsi="Calibri"/>
-                <w:b w:val="0"/>
-                <w:i w:val="0"/>
-                <w:color w:val="031522"/>
-                <w:sz w:val="20"/>
-              </w:rPr>
-              <w:t>ERP + RF / IsolationForest / OLS. Protect ON_TARGET. Move $ off AT_RISK + TREND-DECLINE.</w:t>
-            </w:r>
-          </w:p>
-        </w:tc>
-      </w:tr>
-      <w:tr>
-        <w:tc>
-          <w:tcPr>
-            <w:tcW w:type="dxa" w:w="2304"/>
-          </w:tcPr>
-          <w:p>
-            <w:r/>
-            <w:r>
-              <w:rPr>
-                <w:rFonts w:ascii="Calibri" w:hAnsi="Calibri"/>
-                <w:b/>
-                <w:i w:val="0"/>
-                <w:color w:val="031522"/>
-                <w:sz w:val="20"/>
-              </w:rPr>
-              <w:t>(c) Zero Trust / IL5</w:t>
-            </w:r>
-          </w:p>
-        </w:tc>
-        <w:tc>
-          <w:tcPr>
-            <w:tcW w:type="dxa" w:w="2160"/>
-          </w:tcPr>
-          <w:p>
-            <w:r/>
-            <w:r>
-              <w:rPr>
-                <w:rFonts w:ascii="Calibri" w:hAnsi="Calibri"/>
-                <w:b w:val="0"/>
-                <w:i w:val="0"/>
-                <w:color w:val="031522"/>
-                <w:sz w:val="20"/>
-              </w:rPr>
-              <w:t>On Export</w:t>
-            </w:r>
-          </w:p>
-        </w:tc>
-        <w:tc>
-          <w:tcPr>
-            <w:tcW w:type="dxa" w:w="5472"/>
-          </w:tcPr>
-          <w:p>
-            <w:r/>
-            <w:r>
-              <w:rPr>
-                <w:rFonts w:ascii="Calibri" w:hAnsi="Calibri"/>
-                <w:b w:val="0"/>
-                <w:i w:val="0"/>
-                <w:color w:val="031522"/>
-                <w:sz w:val="20"/>
-              </w:rPr>
-              <w:t>Three planes. App SP ≠ you. Gold SELECT. This cell is commercial AWS Moderate, not IL5.</w:t>
-            </w:r>
-          </w:p>
-        </w:tc>
-      </w:tr>
-      <w:tr>
-        <w:tc>
-          <w:tcPr>
-            <w:tcW w:type="dxa" w:w="2304"/>
-            <w:shd w:fill="E7EFF4" w:val="clear"/>
-          </w:tcPr>
-          <w:p>
-            <w:r/>
-            <w:r>
-              <w:rPr>
-                <w:rFonts w:ascii="Calibri" w:hAnsi="Calibri"/>
-                <w:b/>
-                <w:i w:val="0"/>
-                <w:color w:val="031522"/>
-                <w:sz w:val="20"/>
-              </w:rPr>
-              <w:t>(d) DR / RTO / RPO</w:t>
-            </w:r>
-          </w:p>
-        </w:tc>
-        <w:tc>
-          <w:tcPr>
-            <w:tcW w:type="dxa" w:w="2160"/>
-            <w:shd w:fill="E7EFF4" w:val="clear"/>
-          </w:tcPr>
-          <w:p>
-            <w:r/>
-            <w:r>
-              <w:rPr>
-                <w:rFonts w:ascii="Calibri" w:hAnsi="Calibri"/>
-                <w:b w:val="0"/>
-                <w:i w:val="0"/>
-                <w:color w:val="031522"/>
-                <w:sz w:val="20"/>
-              </w:rPr>
-              <w:t>During Start stream</w:t>
-            </w:r>
-          </w:p>
-        </w:tc>
-        <w:tc>
-          <w:tcPr>
-            <w:tcW w:type="dxa" w:w="5472"/>
-            <w:shd w:fill="E7EFF4" w:val="clear"/>
-          </w:tcPr>
-          <w:p>
-            <w:r/>
-            <w:r>
-              <w:rPr>
-                <w:rFonts w:ascii="Calibri" w:hAnsi="Calibri"/>
-                <w:b w:val="0"/>
-                <w:i w:val="0"/>
-                <w:color w:val="031522"/>
-                <w:sz w:val="20"/>
-              </w:rPr>
-              <w:t>Time travel. Volume durability. Serverless warehouse. Do not restore on camera.</w:t>
-            </w:r>
-          </w:p>
-        </w:tc>
-      </w:tr>
-      <w:tr>
-        <w:tc>
-          <w:tcPr>
-            <w:tcW w:type="dxa" w:w="2304"/>
-          </w:tcPr>
-          <w:p>
-            <w:r/>
-            <w:r>
-              <w:rPr>
-                <w:rFonts w:ascii="Calibri" w:hAnsi="Calibri"/>
-                <w:b/>
-                <w:i w:val="0"/>
-                <w:color w:val="031522"/>
-                <w:sz w:val="20"/>
-              </w:rPr>
-              <w:t>(e) Vendor / lifecycle</w:t>
-            </w:r>
-          </w:p>
-        </w:tc>
-        <w:tc>
-          <w:tcPr>
-            <w:tcW w:type="dxa" w:w="2160"/>
-          </w:tcPr>
-          <w:p>
-            <w:r/>
-            <w:r>
-              <w:rPr>
-                <w:rFonts w:ascii="Calibri" w:hAnsi="Calibri"/>
-                <w:b w:val="0"/>
-                <w:i w:val="0"/>
-                <w:color w:val="031522"/>
-                <w:sz w:val="20"/>
-              </w:rPr>
-              <w:t>On Catalog tags</w:t>
-            </w:r>
-          </w:p>
-        </w:tc>
-        <w:tc>
-          <w:tcPr>
-            <w:tcW w:type="dxa" w:w="5472"/>
-          </w:tcPr>
-          <w:p>
-            <w:r/>
-            <w:r>
-              <w:rPr>
-                <w:rFonts w:ascii="Calibri" w:hAnsi="Calibri"/>
-                <w:b w:val="0"/>
-                <w:i w:val="0"/>
-                <w:color w:val="031522"/>
-                <w:sz w:val="20"/>
-              </w:rPr>
-              <w:t>vendor / license_id / renewal_date. Quality SLO. Last-good gold stays.</w:t>
-            </w:r>
-          </w:p>
-        </w:tc>
-      </w:tr>
-    </w:tbl>
-    <w:p>
-      <w:pPr>
-        <w:spacing w:after="160"/>
-      </w:pPr>
     </w:p>
     <w:p>
       <w:pPr>
@@ -1452,7 +161,7 @@
           <w:color w:val="031522"/>
           <w:sz w:val="22"/>
         </w:rPr>
-        <w:t>Run all 04_mlflow_grant_model.py, then 04b_funding_anomaly.py. Champion alias on funding_anomaly_detector. Do not train on camera.</w:t>
+        <w:t>Run 04_mlflow_grant_model.py, then 04b_funding_anomaly.py. Champion alias on funding_anomaly_detector. Do not train on camera.</w:t>
       </w:r>
     </w:p>
     <w:p>
@@ -1516,7 +225,7 @@
           <w:color w:val="031522"/>
           <w:sz w:val="22"/>
         </w:rPr>
-        <w:t>Park the IdP login page, the GitHub repo (databricks.yml), and a terminal in the Databricks CLI folder. Compass is closed until 4:00.</w:t>
+        <w:t>Open Compass on Home. Do not Restore baseline. Do not unpause file-arrival. Do not retrain.</w:t>
       </w:r>
     </w:p>
     <w:p>
@@ -1534,362 +243,7 @@
           <w:color w:val="082B46"/>
           <w:sz w:val="32"/>
         </w:rPr>
-        <w:t>What is open</w:t>
-      </w:r>
-    </w:p>
-    <w:tbl>
-      <w:tblPr>
-        <w:tblStyle w:val="TableGrid"/>
-        <w:tblW w:type="auto" w:w="0"/>
-        <w:jc w:val="center"/>
-        <w:tblLook w:firstColumn="1" w:firstRow="1" w:lastColumn="0" w:lastRow="0" w:noHBand="0" w:noVBand="1" w:val="04A0"/>
-      </w:tblPr>
-      <w:tblGrid>
-        <w:gridCol w:w="3216"/>
-        <w:gridCol w:w="3216"/>
-        <w:gridCol w:w="3216"/>
-      </w:tblGrid>
-      <w:tr>
-        <w:tc>
-          <w:tcPr>
-            <w:tcW w:type="dxa" w:w="2448"/>
-            <w:shd w:fill="082B46" w:val="clear"/>
-          </w:tcPr>
-          <w:p>
-            <w:r/>
-            <w:r>
-              <w:rPr>
-                <w:rFonts w:ascii="Calibri" w:hAnsi="Calibri"/>
-                <w:b/>
-                <w:i w:val="0"/>
-                <w:color w:val="FFFFFF"/>
-                <w:sz w:val="20"/>
-              </w:rPr>
-              <w:t>Window</w:t>
-            </w:r>
-          </w:p>
-        </w:tc>
-        <w:tc>
-          <w:tcPr>
-            <w:tcW w:type="dxa" w:w="4608"/>
-            <w:shd w:fill="082B46" w:val="clear"/>
-          </w:tcPr>
-          <w:p>
-            <w:r/>
-            <w:r>
-              <w:rPr>
-                <w:rFonts w:ascii="Calibri" w:hAnsi="Calibri"/>
-                <w:b/>
-                <w:i w:val="0"/>
-                <w:color w:val="FFFFFF"/>
-                <w:sz w:val="20"/>
-              </w:rPr>
-              <w:t>Parked on</w:t>
-            </w:r>
-          </w:p>
-        </w:tc>
-        <w:tc>
-          <w:tcPr>
-            <w:tcW w:type="dxa" w:w="2880"/>
-            <w:shd w:fill="082B46" w:val="clear"/>
-          </w:tcPr>
-          <w:p>
-            <w:r/>
-            <w:r>
-              <w:rPr>
-                <w:rFonts w:ascii="Calibri" w:hAnsi="Calibri"/>
-                <w:b/>
-                <w:i w:val="0"/>
-                <w:color w:val="FFFFFF"/>
-                <w:sz w:val="20"/>
-              </w:rPr>
-              <w:t>When it appears</w:t>
-            </w:r>
-          </w:p>
-        </w:tc>
-      </w:tr>
-      <w:tr>
-        <w:tc>
-          <w:tcPr>
-            <w:tcW w:type="dxa" w:w="2448"/>
-          </w:tcPr>
-          <w:p>
-            <w:r/>
-            <w:r>
-              <w:rPr>
-                <w:rFonts w:ascii="Calibri" w:hAnsi="Calibri"/>
-                <w:b/>
-                <w:i w:val="0"/>
-                <w:color w:val="031522"/>
-                <w:sz w:val="20"/>
-              </w:rPr>
-              <w:t>IdP / SSO</w:t>
-            </w:r>
-          </w:p>
-        </w:tc>
-        <w:tc>
-          <w:tcPr>
-            <w:tcW w:type="dxa" w:w="4608"/>
-          </w:tcPr>
-          <w:p>
-            <w:r/>
-            <w:r>
-              <w:rPr>
-                <w:rFonts w:ascii="Calibri" w:hAnsi="Calibri"/>
-                <w:b w:val="0"/>
-                <w:i w:val="0"/>
-                <w:color w:val="031522"/>
-                <w:sz w:val="20"/>
-              </w:rPr>
-              <w:t>Workspace login</w:t>
-            </w:r>
-          </w:p>
-        </w:tc>
-        <w:tc>
-          <w:tcPr>
-            <w:tcW w:type="dxa" w:w="2880"/>
-          </w:tcPr>
-          <w:p>
-            <w:r/>
-            <w:r>
-              <w:rPr>
-                <w:rFonts w:ascii="Calibri" w:hAnsi="Calibri"/>
-                <w:b w:val="0"/>
-                <w:i w:val="0"/>
-                <w:color w:val="031522"/>
-                <w:sz w:val="20"/>
-              </w:rPr>
-              <w:t>0:00</w:t>
-            </w:r>
-          </w:p>
-        </w:tc>
-      </w:tr>
-      <w:tr>
-        <w:tc>
-          <w:tcPr>
-            <w:tcW w:type="dxa" w:w="2448"/>
-            <w:shd w:fill="E7EFF4" w:val="clear"/>
-          </w:tcPr>
-          <w:p>
-            <w:r/>
-            <w:r>
-              <w:rPr>
-                <w:rFonts w:ascii="Calibri" w:hAnsi="Calibri"/>
-                <w:b/>
-                <w:i w:val="0"/>
-                <w:color w:val="031522"/>
-                <w:sz w:val="20"/>
-              </w:rPr>
-              <w:t>GitHub</w:t>
-            </w:r>
-          </w:p>
-        </w:tc>
-        <w:tc>
-          <w:tcPr>
-            <w:tcW w:type="dxa" w:w="4608"/>
-            <w:shd w:fill="E7EFF4" w:val="clear"/>
-          </w:tcPr>
-          <w:p>
-            <w:r/>
-            <w:r>
-              <w:rPr>
-                <w:rFonts w:ascii="Calibri" w:hAnsi="Calibri"/>
-                <w:b w:val="0"/>
-                <w:i w:val="0"/>
-                <w:color w:val="031522"/>
-                <w:sz w:val="20"/>
-              </w:rPr>
-              <w:t>jstrick9/onr_demo  ·  databricks.yml</w:t>
-            </w:r>
-          </w:p>
-        </w:tc>
-        <w:tc>
-          <w:tcPr>
-            <w:tcW w:type="dxa" w:w="2880"/>
-            <w:shd w:fill="E7EFF4" w:val="clear"/>
-          </w:tcPr>
-          <w:p>
-            <w:r/>
-            <w:r>
-              <w:rPr>
-                <w:rFonts w:ascii="Calibri" w:hAnsi="Calibri"/>
-                <w:b w:val="0"/>
-                <w:i w:val="0"/>
-                <w:color w:val="031522"/>
-                <w:sz w:val="20"/>
-              </w:rPr>
-              <w:t>2:00</w:t>
-            </w:r>
-          </w:p>
-        </w:tc>
-      </w:tr>
-      <w:tr>
-        <w:tc>
-          <w:tcPr>
-            <w:tcW w:type="dxa" w:w="2448"/>
-          </w:tcPr>
-          <w:p>
-            <w:r/>
-            <w:r>
-              <w:rPr>
-                <w:rFonts w:ascii="Calibri" w:hAnsi="Calibri"/>
-                <w:b/>
-                <w:i w:val="0"/>
-                <w:color w:val="031522"/>
-                <w:sz w:val="20"/>
-              </w:rPr>
-              <w:t>Terminal</w:t>
-            </w:r>
-          </w:p>
-        </w:tc>
-        <w:tc>
-          <w:tcPr>
-            <w:tcW w:type="dxa" w:w="4608"/>
-          </w:tcPr>
-          <w:p>
-            <w:r/>
-            <w:r>
-              <w:rPr>
-                <w:rFonts w:ascii="Calibri" w:hAnsi="Calibri"/>
-                <w:b w:val="0"/>
-                <w:i w:val="0"/>
-                <w:color w:val="031522"/>
-                <w:sz w:val="20"/>
-              </w:rPr>
-              <w:t>Repo root, CLI authenticated</w:t>
-            </w:r>
-          </w:p>
-        </w:tc>
-        <w:tc>
-          <w:tcPr>
-            <w:tcW w:type="dxa" w:w="2880"/>
-          </w:tcPr>
-          <w:p>
-            <w:r/>
-            <w:r>
-              <w:rPr>
-                <w:rFonts w:ascii="Calibri" w:hAnsi="Calibri"/>
-                <w:b w:val="0"/>
-                <w:i w:val="0"/>
-                <w:color w:val="031522"/>
-                <w:sz w:val="20"/>
-              </w:rPr>
-              <w:t>2:30</w:t>
-            </w:r>
-          </w:p>
-        </w:tc>
-      </w:tr>
-      <w:tr>
-        <w:tc>
-          <w:tcPr>
-            <w:tcW w:type="dxa" w:w="2448"/>
-            <w:shd w:fill="E7EFF4" w:val="clear"/>
-          </w:tcPr>
-          <w:p>
-            <w:r/>
-            <w:r>
-              <w:rPr>
-                <w:rFonts w:ascii="Calibri" w:hAnsi="Calibri"/>
-                <w:b/>
-                <w:i w:val="0"/>
-                <w:color w:val="031522"/>
-                <w:sz w:val="20"/>
-              </w:rPr>
-              <w:t>Compass  ·  onr-demo-poc</w:t>
-            </w:r>
-          </w:p>
-        </w:tc>
-        <w:tc>
-          <w:tcPr>
-            <w:tcW w:type="dxa" w:w="4608"/>
-            <w:shd w:fill="E7EFF4" w:val="clear"/>
-          </w:tcPr>
-          <w:p>
-            <w:r/>
-            <w:r>
-              <w:rPr>
-                <w:rFonts w:ascii="Calibri" w:hAnsi="Calibri"/>
-                <w:b w:val="0"/>
-                <w:i w:val="0"/>
-                <w:color w:val="031522"/>
-                <w:sz w:val="20"/>
-              </w:rPr>
-              <w:t>Infrastructure</w:t>
-            </w:r>
-          </w:p>
-        </w:tc>
-        <w:tc>
-          <w:tcPr>
-            <w:tcW w:type="dxa" w:w="2880"/>
-            <w:shd w:fill="E7EFF4" w:val="clear"/>
-          </w:tcPr>
-          <w:p>
-            <w:r/>
-            <w:r>
-              <w:rPr>
-                <w:rFonts w:ascii="Calibri" w:hAnsi="Calibri"/>
-                <w:b w:val="0"/>
-                <w:i w:val="0"/>
-                <w:color w:val="031522"/>
-                <w:sz w:val="20"/>
-              </w:rPr>
-              <w:t>4:00 — not before</w:t>
-            </w:r>
-          </w:p>
-        </w:tc>
-      </w:tr>
-    </w:tbl>
-    <w:p>
-      <w:pPr>
-        <w:spacing w:after="160"/>
-      </w:pPr>
-    </w:p>
-    <w:p>
-      <w:pPr>
-        <w:spacing w:before="320" w:after="120"/>
-        <w:pBdr>
-          <w:bottom w:val="single" w:sz="12" w:space="4" w:color="8C6A22"/>
-        </w:pBdr>
-      </w:pPr>
-      <w:r>
-        <w:rPr>
-          <w:rFonts w:ascii="Calibri" w:hAnsi="Calibri"/>
-          <w:b/>
-          <w:i w:val="0"/>
-          <w:color w:val="082B46"/>
-          <w:sz w:val="32"/>
-        </w:rPr>
-        <w:t>Part A — before Compass  (0:00–4:00)</w:t>
-      </w:r>
-    </w:p>
-    <w:p>
-      <w:pPr>
-        <w:spacing w:after="200" w:before="0" w:line="276" w:lineRule="auto"/>
-      </w:pPr>
-      <w:r>
-        <w:rPr>
-          <w:rFonts w:ascii="Calibri" w:hAnsi="Calibri"/>
-          <w:b w:val="0"/>
-          <w:i w:val="0"/>
-          <w:color w:val="031522"/>
-          <w:sz w:val="22"/>
-        </w:rPr>
-        <w:t>Element 1 and most of Element 2 happen outside this app. The spoken lines below are the Databricks version of that cold open so this 25-minute file still covers official 11.3. If your live MFA and live deploy are already in the AWS-native recording, still do a short Databricks-specific pass here — different IdP session, different repo, different command.</w:t>
-      </w:r>
-    </w:p>
-    <w:p>
-      <w:pPr>
-        <w:spacing w:before="240" w:after="120"/>
-      </w:pPr>
-      <w:r>
-        <w:rPr>
-          <w:rFonts w:ascii="Calibri" w:hAnsi="Calibri"/>
-          <w:b/>
-          <w:i w:val="0"/>
-          <w:color w:val="8C6A22"/>
-          <w:sz w:val="26"/>
-        </w:rPr>
-        <w:t>0:00–2:00  ·  Element 1  ·  Secure access, MFA, Zero Trust</w:t>
+        <w:t>Home</w:t>
       </w:r>
     </w:p>
     <w:p>
@@ -1916,7 +270,7 @@
           <w:color w:val="031522"/>
           <w:sz w:val="22"/>
         </w:rPr>
-        <w:t>Browser on the Databricks workspace login — not Compass. Start recording. Complete the identity-provider sign-in including the MFA challenge. Do not skip the challenge. Do not screenshot it later.</w:t>
+        <w:t>Recording starts with Compass open on Home. Do not open Architecture. Do not linger on Access.</w:t>
       </w:r>
     </w:p>
     <w:p>
@@ -1931,67 +285,7 @@
           <w:color w:val="031522"/>
           <w:sz w:val="22"/>
         </w:rPr>
-        <w:t>This is the Databricks path of the ONR Code 08 demonstration. Everything you will see is mock, synthetic Compass data. No CUI, no PII, no classified.</w:t>
-      </w:r>
-    </w:p>
-    <w:p>
-      <w:pPr>
-        <w:spacing w:after="160" w:before="0" w:line="276" w:lineRule="auto"/>
-      </w:pPr>
-      <w:r>
-        <w:rPr>
-          <w:rFonts w:ascii="Calibri" w:hAnsi="Calibri"/>
-          <w:b w:val="0"/>
-          <w:i w:val="0"/>
-          <w:color w:val="031522"/>
-          <w:sz w:val="22"/>
-        </w:rPr>
-        <w:t>Element one: secure access, authentication, and Zero Trust.</w:t>
-      </w:r>
-    </w:p>
-    <w:p>
-      <w:pPr>
-        <w:spacing w:after="160" w:before="0" w:line="276" w:lineRule="auto"/>
-      </w:pPr>
-      <w:r>
-        <w:rPr>
-          <w:rFonts w:ascii="Calibri" w:hAnsi="Calibri"/>
-          <w:b w:val="0"/>
-          <w:i w:val="0"/>
-          <w:color w:val="031522"/>
-          <w:sz w:val="22"/>
-        </w:rPr>
-        <w:t>I am authenticating at the workspace identity provider — not inside an application form. Multi-factor authentication is the IdP challenge you just saw. There will be no password field in the Compass console. That is the Zero Trust control plane: identity is evaluated before the data plane opens.</w:t>
-      </w:r>
-    </w:p>
-    <w:p>
-      <w:pPr>
-        <w:spacing w:after="160" w:before="0" w:line="276" w:lineRule="auto"/>
-      </w:pPr>
-      <w:r>
-        <w:rPr>
-          <w:rFonts w:ascii="Calibri" w:hAnsi="Calibri"/>
-          <w:b w:val="0"/>
-          <w:i w:val="0"/>
-          <w:color w:val="031522"/>
-          <w:sz w:val="22"/>
-        </w:rPr>
-        <w:t>Least privilege starts here. The human session is mine. The Databricks App we will open has its own service principal. It does not borrow this token. Analysts SELECT gold. They never see bronze. Continuous authorization is the audit we will write on every search and every export.</w:t>
-      </w:r>
-    </w:p>
-    <w:p>
-      <w:pPr>
-        <w:spacing w:after="160" w:before="0" w:line="276" w:lineRule="auto"/>
-      </w:pPr>
-      <w:r>
-        <w:rPr>
-          <w:rFonts w:ascii="Calibri" w:hAnsi="Calibri"/>
-          <w:b w:val="0"/>
-          <w:i w:val="0"/>
-          <w:color w:val="031522"/>
-          <w:sz w:val="22"/>
-        </w:rPr>
-        <w:t>This cell is unclassified mock on commercial AWS — FedRAMP Moderate. The IL5 production cell is GovCloud, PrivateLink, customer-managed KMS. I will return to that on Element seven. We are not claiming this POC is IL5.</w:t>
+        <w:t>This is Project Compass, the Code 08 portfolio console. Four hundred synthetic grants, four hundred thirty-seven million dollars. Everything on this tape is mock data. No CUI, no PII, no classified.</w:t>
       </w:r>
     </w:p>
     <w:p>
@@ -2018,22 +312,25 @@
           <w:color w:val="031522"/>
           <w:sz w:val="22"/>
         </w:rPr>
-        <w:t>Leave the workspace signed in. Do not open Compass yet.</w:t>
+        <w:t>Click Infrastructure.</w:t>
       </w:r>
     </w:p>
     <w:p>
       <w:pPr>
-        <w:spacing w:before="240" w:after="120"/>
+        <w:spacing w:before="320" w:after="120"/>
+        <w:pBdr>
+          <w:bottom w:val="single" w:sz="12" w:space="4" w:color="8C6A22"/>
+        </w:pBdr>
       </w:pPr>
       <w:r>
         <w:rPr>
           <w:rFonts w:ascii="Calibri" w:hAnsi="Calibri"/>
           <w:b/>
           <w:i w:val="0"/>
-          <w:color w:val="8C6A22"/>
-          <w:sz w:val="26"/>
+          <w:color w:val="082B46"/>
+          <w:sz w:val="32"/>
         </w:rPr>
-        <w:t>2:00–4:00  ·  Element 2  ·  IaC, version control, CI/CD  (most of it)</w:t>
+        <w:t>Infrastructure  ·  Element 2, briefly</w:t>
       </w:r>
     </w:p>
     <w:p>
@@ -2060,7 +357,7 @@
           <w:color w:val="031522"/>
           <w:sz w:val="22"/>
         </w:rPr>
-        <w:t>Switch to GitHub — github.com/jstrick9/onr_demo — file databricks.yml. Scroll enough to show volumes, the app, the paused file-arrival job, and the SDP pipeline. Do not scroll the whole file.</w:t>
+        <w:t>Cursor on Estate. Three tiles: warehouse, score cluster, file-arrival job. Do not open Inventory, Identity, or Full bundle. Do not look for a Deploy button — there is not one.</w:t>
       </w:r>
     </w:p>
     <w:p>
@@ -2075,7 +372,7 @@
           <w:color w:val="031522"/>
           <w:sz w:val="22"/>
         </w:rPr>
-        <w:t>Element two: infrastructure as code and automation.</w:t>
+        <w:t>Element two: infrastructure as code.</w:t>
       </w:r>
     </w:p>
     <w:p>
@@ -2090,196 +387,7 @@
           <w:color w:val="031522"/>
           <w:sz w:val="22"/>
         </w:rPr>
-        <w:t>The demonstration estate is a Databricks Asset Bundle in this repository. The file is databricks.yml. Target poc. It manages the landing Volume, the checkpoint Volume, the Databricks App onr-demo-poc, the paused file-arrival job, and the SDP pipeline. It does not create the SQL warehouse or the clusters — those are pre-existing named compute: onr demo warehouse, onr demo cluster, onr demo ml.</w:t>
-      </w:r>
-    </w:p>
-    <w:p>
-      <w:pPr>
-        <w:spacing w:before="160" w:after="160"/>
-        <w:ind w:left="216"/>
-        <w:shd w:fill="F5EDD9" w:val="clear"/>
-      </w:pPr>
-      <w:r>
-        <w:rPr>
-          <w:rFonts w:ascii="Calibri" w:hAnsi="Calibri"/>
-          <w:b/>
-          <w:i/>
-          <w:color w:val="8C6A22"/>
-          <w:sz w:val="22"/>
-        </w:rPr>
-        <w:t xml:space="preserve">[DO THIS]  </w:t>
-      </w:r>
-      <w:r>
-        <w:rPr>
-          <w:rFonts w:ascii="Calibri" w:hAnsi="Calibri"/>
-          <w:b w:val="0"/>
-          <w:i/>
-          <w:color w:val="031522"/>
-          <w:sz w:val="22"/>
-        </w:rPr>
-        <w:t>Terminal at the repo root. Show the command. If you have already deployed tonight, do not apply again — read the command and the last successful deploy. If you have not deployed, run it and keep talking.</w:t>
-      </w:r>
-    </w:p>
-    <w:p>
-      <w:pPr>
-        <w:spacing w:after="160" w:before="0" w:line="276" w:lineRule="auto"/>
-      </w:pPr>
-      <w:r>
-        <w:rPr>
-          <w:rFonts w:ascii="Calibri" w:hAnsi="Calibri"/>
-          <w:b w:val="0"/>
-          <w:i w:val="0"/>
-          <w:color w:val="031522"/>
-          <w:sz w:val="22"/>
-        </w:rPr>
-        <w:t>Deploy is this command: databricks bundle deploy dash t poc. Version-controlled in Git. The same file a GitHub Action would call. There is no Deploy button in the application we are about to open. Configuration is reviewed in pull requests, not clicked in a console.</w:t>
-      </w:r>
-    </w:p>
-    <w:p>
-      <w:pPr>
-        <w:spacing w:after="160" w:before="0" w:line="276" w:lineRule="auto"/>
-      </w:pPr>
-      <w:r>
-        <w:rPr>
-          <w:rFonts w:ascii="Calibri" w:hAnsi="Calibri"/>
-          <w:b w:val="0"/>
-          <w:i w:val="0"/>
-          <w:color w:val="031522"/>
-          <w:sz w:val="22"/>
-        </w:rPr>
-        <w:t>That is the bulk of Element two. Compass will show the inventory that this deploy produced — not a second provision.</w:t>
-      </w:r>
-    </w:p>
-    <w:p>
-      <w:pPr>
-        <w:spacing w:before="160" w:after="160"/>
-        <w:ind w:left="216"/>
-        <w:shd w:fill="F5EDD9" w:val="clear"/>
-      </w:pPr>
-      <w:r>
-        <w:rPr>
-          <w:rFonts w:ascii="Calibri" w:hAnsi="Calibri"/>
-          <w:b/>
-          <w:i/>
-          <w:color w:val="8C6A22"/>
-          <w:sz w:val="22"/>
-        </w:rPr>
-        <w:t xml:space="preserve">[DO THIS]  </w:t>
-      </w:r>
-      <w:r>
-        <w:rPr>
-          <w:rFonts w:ascii="Calibri" w:hAnsi="Calibri"/>
-          <w:b w:val="0"/>
-          <w:i/>
-          <w:color w:val="031522"/>
-          <w:sz w:val="22"/>
-        </w:rPr>
-        <w:t>Open the Databricks App onr-demo-poc. Land on Infrastructure. Sidebar order is Home, Infrastructure, Ingestion, Catalog, Analytics, Portfolio, Export. Do not start on Home unless Active grants is not 400 — if it says fixture, stop and do not fake ingest.</w:t>
-      </w:r>
-    </w:p>
-    <w:p>
-      <w:pPr>
-        <w:spacing w:before="320" w:after="120"/>
-        <w:pBdr>
-          <w:bottom w:val="single" w:sz="12" w:space="4" w:color="8C6A22"/>
-        </w:pBdr>
-      </w:pPr>
-      <w:r>
-        <w:rPr>
-          <w:rFonts w:ascii="Calibri" w:hAnsi="Calibri"/>
-          <w:b/>
-          <w:i w:val="0"/>
-          <w:color w:val="082B46"/>
-          <w:sz w:val="32"/>
-        </w:rPr>
-        <w:t>Part B — Compass  (4:00–25:00)</w:t>
-      </w:r>
-    </w:p>
-    <w:p>
-      <w:pPr>
-        <w:spacing w:after="200" w:before="0" w:line="276" w:lineRule="auto"/>
-      </w:pPr>
-      <w:r>
-        <w:rPr>
-          <w:rFonts w:ascii="Calibri" w:hAnsi="Calibri"/>
-          <w:b w:val="0"/>
-          <w:i/>
-          <w:color w:val="5B6B80"/>
-          <w:sz w:val="22"/>
-        </w:rPr>
-        <w:t>Partial Element 2, then Elements 3 through 7, with strategic prompts (a) through (e) woven in.</w:t>
-      </w:r>
-    </w:p>
-    <w:p>
-      <w:pPr>
-        <w:spacing w:before="240" w:after="120"/>
-      </w:pPr>
-      <w:r>
-        <w:rPr>
-          <w:rFonts w:ascii="Calibri" w:hAnsi="Calibri"/>
-          <w:b/>
-          <w:i w:val="0"/>
-          <w:color w:val="8C6A22"/>
-          <w:sz w:val="26"/>
-        </w:rPr>
-        <w:t>4:00–4:40  ·  Element 2 remainder  ·  Infrastructure</w:t>
-      </w:r>
-    </w:p>
-    <w:p>
-      <w:pPr>
-        <w:spacing w:before="160" w:after="160"/>
-        <w:ind w:left="216"/>
-        <w:shd w:fill="F5EDD9" w:val="clear"/>
-      </w:pPr>
-      <w:r>
-        <w:rPr>
-          <w:rFonts w:ascii="Calibri" w:hAnsi="Calibri"/>
-          <w:b/>
-          <w:i/>
-          <w:color w:val="8C6A22"/>
-          <w:sz w:val="22"/>
-        </w:rPr>
-        <w:t xml:space="preserve">[DO THIS]  </w:t>
-      </w:r>
-      <w:r>
-        <w:rPr>
-          <w:rFonts w:ascii="Calibri" w:hAnsi="Calibri"/>
-          <w:b w:val="0"/>
-          <w:i/>
-          <w:color w:val="031522"/>
-          <w:sz w:val="22"/>
-        </w:rPr>
-        <w:t>Cursor on Estate. Three tiles: warehouse, score cluster, file-arrival job. Do not open Full bundle unless a reviewer asks. Do not look for a Deploy button — there is not one.</w:t>
-      </w:r>
-    </w:p>
-    <w:p>
-      <w:pPr>
-        <w:spacing w:after="160" w:before="0" w:line="276" w:lineRule="auto"/>
-      </w:pPr>
-      <w:r>
-        <w:rPr>
-          <w:rFonts w:ascii="Calibri" w:hAnsi="Calibri"/>
-          <w:b w:val="0"/>
-          <w:i w:val="0"/>
-          <w:color w:val="031522"/>
-          <w:sz w:val="22"/>
-        </w:rPr>
-        <w:t>This is the inventory of the bundle we just walked. Warehouse onr demo warehouse — serverless SQL, serving this console. Score cluster onr demo ml — dedicated to the app service principal. File-arrival job — paused. The app you are looking at is onr-demo-poc. Catalog onr_demo, medallion bronze, silver, gold, and app.</w:t>
-      </w:r>
-    </w:p>
-    <w:p>
-      <w:pPr>
-        <w:spacing w:after="160" w:before="0" w:line="276" w:lineRule="auto"/>
-      </w:pPr>
-      <w:r>
-        <w:rPr>
-          <w:rFonts w:ascii="Calibri" w:hAnsi="Calibri"/>
-          <w:b w:val="0"/>
-          <w:i w:val="0"/>
-          <w:color w:val="031522"/>
-          <w:sz w:val="22"/>
-        </w:rPr>
-        <w:t>Logged-in user in the sidebar is my IdP session. The app is a different principal. That is the same Zero Trust split I signed in with.</w:t>
+        <w:t>This page is the inventory of the estate that was deployed from version control. It is not a second provision. The warehouse serves this console. The score cluster is dedicated to the application identity, not to me. File-arrival is paused. There is no Deploy button in this console. Configuration is reviewed in Git, not clicked here.</w:t>
       </w:r>
     </w:p>
     <w:p>
@@ -2311,17 +419,20 @@
     </w:p>
     <w:p>
       <w:pPr>
-        <w:spacing w:before="240" w:after="120"/>
+        <w:spacing w:before="320" w:after="120"/>
+        <w:pBdr>
+          <w:bottom w:val="single" w:sz="12" w:space="4" w:color="8C6A22"/>
+        </w:pBdr>
       </w:pPr>
       <w:r>
         <w:rPr>
           <w:rFonts w:ascii="Calibri" w:hAnsi="Calibri"/>
           <w:b/>
           <w:i w:val="0"/>
-          <w:color w:val="8C6A22"/>
-          <w:sz w:val="26"/>
+          <w:color w:val="082B46"/>
+          <w:sz w:val="32"/>
         </w:rPr>
-        <w:t>4:40–10:30  ·  Element 3  ·  Ingestion  ·  prompts (a) and (d)</w:t>
+        <w:t>Ingestion  ·  Element 3  ·  prompts (a) and (d)</w:t>
       </w:r>
     </w:p>
     <w:p>
@@ -2351,7 +462,7 @@
           <w:color w:val="031522"/>
           <w:sz w:val="22"/>
         </w:rPr>
-        <w:t>A new grants file has arrived. I am not recoding a pipeline. The staged files are already on the Unity Catalog Volume. Inbound grants is the good file. Quarantine sample is three bad rows — empty grant number, negative amount, and a duplicate.</w:t>
+        <w:t>A new grants file has arrived. I am not recoding a pipeline. Inbound grants is the good file. Quarantine sample is three bad rows — empty grant number, negative amount, and a duplicate.</w:t>
       </w:r>
     </w:p>
     <w:p>
@@ -2408,7 +519,7 @@
           <w:color w:val="031522"/>
           <w:sz w:val="22"/>
         </w:rPr>
-        <w:t>We do not cut over the D-and-A Portal, the reporting stack, or the existing ETL in a weekend. The pattern is strangler-fig coexistence. New files land in /Volumes/onr_demo/bronze/landing/grants/ — governed object storage, not a DBFS mount. The warehouse path this button just used, and the Auto Loader path I will start next, write the same bronze Delta table. Legacy reports keep reading gold over JDBC. When a report is ready to retire, we point it at the table this app already uses. Rollback is delete-the-batch, not rewrite-the-estate.</w:t>
+        <w:t>We do not cut over the D-and-A Portal, the reporting stack, or the existing ETL in a weekend. The pattern is strangler-fig coexistence. New files land in a governed landing zone. Both the path this button just used and the file-arrival path I will start next write the same bronze table — the landing table. Legacy reports keep reading the serving layer over a standard connection. When a report is ready to retire, we point it at the table this console already uses. Rollback is delete-the-batch, not rewrite-the-estate.</w:t>
       </w:r>
     </w:p>
     <w:p>
@@ -2450,7 +561,7 @@
           <w:color w:val="031522"/>
           <w:sz w:val="22"/>
         </w:rPr>
-        <w:t>There it is. Eight rows published. The three quarantine rows never entered bronze — they are in app.quarantine_log. One live grant published with a warning, missing abstract, in app.quality_findings. Quality is the tab if a reviewer wants the scoreboard. We do not need it on this clock.</w:t>
+        <w:t>Eight rows published. The three quarantine rows never entered the landing table — they are held. One live grant published with a warning, missing abstract. Quality is the tab if a reviewer wants the scoreboard. We do not need it here.</w:t>
       </w:r>
     </w:p>
     <w:p>
@@ -2465,7 +576,7 @@
           <w:color w:val="031522"/>
           <w:sz w:val="22"/>
         </w:rPr>
-        <w:t>Same Element three. That button was the warehouse SQL path. Next is file-arrival. I am not leaving this console.</w:t>
+        <w:t>Same Element three. That button was the warehouse path. Next is file arrival. I am not leaving this console.</w:t>
       </w:r>
     </w:p>
     <w:p>
@@ -2507,7 +618,7 @@
           <w:color w:val="031522"/>
           <w:sz w:val="22"/>
         </w:rPr>
-        <w:t>The console just wrote a new batch_live_grants_stream file onto the landing Volume and loaded it into the same bronze table. That is the stream proof: file arrival, not a scheduled batch. Auto Loader — cloudFiles — is the Spark job on that Volume. Open 01b if a reviewer wants the job run. We do not wait on Jobs serverless cold start on this tape.</w:t>
+        <w:t>The console just landed a new file and loaded it into the same bronze table. That is file-arrival, not a scheduled batch. Open stream notebook is there if a reviewer wants the job. We do not wait on a cold start.</w:t>
       </w:r>
     </w:p>
     <w:p>
@@ -2549,7 +660,7 @@
           <w:color w:val="031522"/>
           <w:sz w:val="22"/>
         </w:rPr>
-        <w:t>Bronze ticks. Silver stays at four hundred and eight because silver dedupes on grant_no. Kafka or Kinesis would be the equivalent bus on another estate. Here the open equivalent is a Unity Catalog Volume plus Auto Loader.</w:t>
+        <w:t>Bronze ticks. Silver — the trusted table — stays at four hundred and eight because it dedupes on grant number. The serving layer does not double-count the same award.</w:t>
       </w:r>
     </w:p>
     <w:p>
@@ -2579,7 +690,7 @@
           <w:color w:val="031522"/>
           <w:sz w:val="22"/>
         </w:rPr>
-        <w:t>Contract targets: RPO fifteen minutes for gold, essentially zero for bronze landing — the file is still sitting in the Volume. Delta time-travel is the row-level RPO — baseline snapshot versus now. We are not restoring on camera. RTO thirty minutes to serving gold, about five minutes to serving the app. The warehouse is serverless. The app is already deployed. The all-purpose cluster is not on the serving path. Annual DR is non-disruptive: pause file-arrival, restore yesterday’s gold into a onr_demo_dr catalog, point a clone of the app at it, validate, tear down.</w:t>
+        <w:t>Contract targets: RPO fifteen minutes for the serving layer, essentially zero for landing — the file is still sitting in object storage. Time travel is the row-level RPO — baseline snapshot versus now. We are not restoring on camera. RTO thirty minutes to serving gold, about five minutes to serving the app. Annual DR is non-disruptive: pause file-arrival, restore yesterday’s gold into a side catalog, point a clone of the console at it, validate, tear down.</w:t>
       </w:r>
     </w:p>
     <w:p>
@@ -2611,17 +722,20 @@
     </w:p>
     <w:p>
       <w:pPr>
-        <w:spacing w:before="240" w:after="120"/>
+        <w:spacing w:before="320" w:after="120"/>
+        <w:pBdr>
+          <w:bottom w:val="single" w:sz="12" w:space="4" w:color="8C6A22"/>
+        </w:pBdr>
       </w:pPr>
       <w:r>
         <w:rPr>
           <w:rFonts w:ascii="Calibri" w:hAnsi="Calibri"/>
           <w:b/>
           <w:i w:val="0"/>
-          <w:color w:val="8C6A22"/>
-          <w:sz w:val="26"/>
+          <w:color w:val="082B46"/>
+          <w:sz w:val="32"/>
         </w:rPr>
-        <w:t>10:30–13:00  ·  Element 4  ·  Catalog  ·  prompt (e)</w:t>
+        <w:t>Catalog  ·  Element 4  ·  prompt (e)</w:t>
       </w:r>
     </w:p>
     <w:p>
@@ -2678,7 +792,7 @@
           <w:color w:val="031522"/>
           <w:sz w:val="22"/>
         </w:rPr>
-        <w:t>This is Unity Catalog’s native lineage — landing Volume, to bronze, to silver, to gold, to the app. That graph is the Element four visual. This console is the operator surface, not the system of record.</w:t>
+        <w:t>Open lineage is the catalog’s native graph — landing, to bronze, to silver, to gold, to this console. That graph is the Element four visual. This console is the operator surface, not the system of record.</w:t>
       </w:r>
     </w:p>
     <w:p>
@@ -2819,7 +933,7 @@
           <w:color w:val="031522"/>
           <w:sz w:val="22"/>
         </w:rPr>
-        <w:t>Every external feed is a licensed product: owner, renewal date, quality SLO. Today the tags are data_source, domain, data_sensitivity. In production we add vendor, license_id, renewal_date. Usage is metered in app.export_history and app.search_history. If a subscription stops, Auto Loader has nothing new. Last-good gold stays. We do not auto-delete.</w:t>
+        <w:t>Every external feed is a licensed product: owner, renewal date, quality SLO. Today the tags are data_source, domain, data_sensitivity. In production we add vendor, license_id, renewal_date. Usage is metered on every search and every export. If a subscription stops, nothing new lands. Last-good gold stays. We do not auto-delete.</w:t>
       </w:r>
     </w:p>
     <w:p>
@@ -2851,17 +965,20 @@
     </w:p>
     <w:p>
       <w:pPr>
-        <w:spacing w:before="240" w:after="120"/>
+        <w:spacing w:before="320" w:after="120"/>
+        <w:pBdr>
+          <w:bottom w:val="single" w:sz="12" w:space="4" w:color="8C6A22"/>
+        </w:pBdr>
       </w:pPr>
       <w:r>
         <w:rPr>
           <w:rFonts w:ascii="Calibri" w:hAnsi="Calibri"/>
           <w:b/>
           <w:i w:val="0"/>
-          <w:color w:val="8C6A22"/>
-          <w:sz w:val="26"/>
+          <w:color w:val="082B46"/>
+          <w:sz w:val="32"/>
         </w:rPr>
-        <w:t>13:00–18:00  ·  Element 5  ·  Analytics  ·  prompt (b)</w:t>
+        <w:t>Analytics  ·  Element 5  ·  prompt (b)</w:t>
       </w:r>
     </w:p>
     <w:p>
@@ -2891,7 +1008,7 @@
           <w:color w:val="031522"/>
           <w:sz w:val="22"/>
         </w:rPr>
-        <w:t>The models were trained last night and registered in Unity Catalog. I am not retraining on camera. I am triggering a live score against the portfolio we just ingested — including the eight new grants.</w:t>
+        <w:t>The models were trained last night and registered in the catalog. I am not retraining on camera. I am triggering a live score against the portfolio we just ingested — including the eight new grants.</w:t>
       </w:r>
     </w:p>
     <w:p>
@@ -2933,6 +1050,21 @@
           <w:color w:val="031522"/>
           <w:sz w:val="22"/>
         </w:rPr>
+        <w:t>Score registered models — that button scores the current portfolio from models already in the catalog. It does not train.</w:t>
+      </w:r>
+    </w:p>
+    <w:p>
+      <w:pPr>
+        <w:spacing w:after="160" w:before="0" w:line="276" w:lineRule="auto"/>
+      </w:pPr>
+      <w:r>
+        <w:rPr>
+          <w:rFonts w:ascii="Calibri" w:hAnsi="Calibri"/>
+          <w:b w:val="0"/>
+          <w:i w:val="0"/>
+          <w:color w:val="031522"/>
+          <w:sz w:val="22"/>
+        </w:rPr>
         <w:t>Strategic prompt (b) — financial and budgetary analytical integration.</w:t>
       </w:r>
     </w:p>
@@ -2948,7 +1080,7 @@
           <w:color w:val="031522"/>
           <w:sz w:val="22"/>
         </w:rPr>
-        <w:t>Financial execution is a first-class feed: twelve hundred ERP lines — budget, actual, execution rate — into gold.budget_execution. Three complementary models, all on this ingested portfolio, not a second dataset.</w:t>
+        <w:t>Financial execution is a first-class feed: twelve hundred ERP lines — budget, actual, execution rate. Three complementary models, all on this ingested portfolio, not a second dataset.</w:t>
       </w:r>
     </w:p>
     <w:p>
@@ -2978,7 +1110,7 @@
           <w:color w:val="031522"/>
           <w:sz w:val="22"/>
         </w:rPr>
-        <w:t>Predictive: a Random Forest large-award classifier — Fund, Review, or Defer — registered as onr_demo.gold.grant_large_award. An IsolationForest for budget spike, execution collapse, and low-return concentration — funding_anomaly_detector at alias champion. And ordinary least squares, ols_fy_v1, two-year horizon, ninety-five percent band, trend IDs TREND-ACCEL, TREND-STEADY, TREND-DECLINE. That is OLS, not Prophet.</w:t>
+        <w:t>Predictive: a Random Forest large-award classifier — Fund, Review, or Defer. An IsolationForest for budget spike, execution collapse, and low-return concentration. And ordinary least squares, two-year horizon, ninety-five percent band, trend IDs TREND-ACCEL, TREND-STEADY, TREND-DECLINE. That is OLS, not Prophet.</w:t>
       </w:r>
     </w:p>
     <w:p>
@@ -2993,7 +1125,7 @@
           <w:color w:val="031522"/>
           <w:sz w:val="22"/>
         </w:rPr>
-        <w:t>Prescriptive: protect ON_TARGET, move dollars off AT_RISK and TREND-DECLINE, review large-award concentration. Engineer owns bronze and silver. Scientist owns the registered models. Analyst owns gold and the daily brief. Same catalog.</w:t>
+        <w:t>Prescriptive: protect ON_TARGET, move dollars off AT_RISK and TREND-DECLINE, review large-award concentration. Engineer owns landing and trusted. Scientist owns the registered models. Analyst owns the serving layer and the daily brief. Same catalog.</w:t>
       </w:r>
     </w:p>
     <w:p>
@@ -3109,17 +1241,20 @@
     </w:p>
     <w:p>
       <w:pPr>
-        <w:spacing w:before="240" w:after="120"/>
+        <w:spacing w:before="320" w:after="120"/>
+        <w:pBdr>
+          <w:bottom w:val="single" w:sz="12" w:space="4" w:color="8C6A22"/>
+        </w:pBdr>
       </w:pPr>
       <w:r>
         <w:rPr>
           <w:rFonts w:ascii="Calibri" w:hAnsi="Calibri"/>
           <w:b/>
           <w:i w:val="0"/>
-          <w:color w:val="8C6A22"/>
-          <w:sz w:val="26"/>
+          <w:color w:val="082B46"/>
+          <w:sz w:val="32"/>
         </w:rPr>
-        <w:t>18:00–20:30  ·  Element 6  ·  Portfolio</w:t>
+        <w:t>Portfolio  ·  Element 6</w:t>
       </w:r>
     </w:p>
     <w:p>
@@ -3191,7 +1326,7 @@
           <w:color w:val="031522"/>
           <w:sz w:val="22"/>
         </w:rPr>
-        <w:t>Search is live against gold. It is written to app.search_history. That is the audit Zero Trust asked for, and it is the usage meter for prompt (e).</w:t>
+        <w:t>Search is live against the serving layer. It is written to the search history. That is the audit Zero Trust asked for, and it is the usage meter for prompt (e).</w:t>
       </w:r>
     </w:p>
     <w:p>
@@ -3233,7 +1368,7 @@
           <w:color w:val="031522"/>
           <w:sz w:val="22"/>
         </w:rPr>
-        <w:t>Automated summary. Classification banner, three bullets, one recommended action. If Foundation Model serving is on, this is ai_query. If not, it is the structured template. Either way a row lands in app.daily_briefs. That is process automation — not a staffer writing the morning book.</w:t>
+        <w:t>Generate daily brief — automated summary. Classification banner, three bullets, one recommended action. A row lands in the brief log. That is process automation — not a staffer writing the morning book.</w:t>
       </w:r>
     </w:p>
     <w:p>
@@ -3275,22 +1410,25 @@
           <w:color w:val="031522"/>
           <w:sz w:val="22"/>
         </w:rPr>
-        <w:t>Same gold the forecast used. AT_RISK plus TREND-DECLINE is the reallocation set. Extract is next.</w:t>
+        <w:t>Same serving layer the forecast used. AT_RISK plus TREND-DECLINE is the reallocation set. Extract is next.</w:t>
       </w:r>
     </w:p>
     <w:p>
       <w:pPr>
-        <w:spacing w:before="240" w:after="120"/>
+        <w:spacing w:before="320" w:after="120"/>
+        <w:pBdr>
+          <w:bottom w:val="single" w:sz="12" w:space="4" w:color="8C6A22"/>
+        </w:pBdr>
       </w:pPr>
       <w:r>
         <w:rPr>
           <w:rFonts w:ascii="Calibri" w:hAnsi="Calibri"/>
           <w:b/>
           <w:i w:val="0"/>
-          <w:color w:val="8C6A22"/>
-          <w:sz w:val="26"/>
+          <w:color w:val="082B46"/>
+          <w:sz w:val="32"/>
         </w:rPr>
-        <w:t>20:30–25:00  ·  Element 7  ·  Export  ·  prompt (c)</w:t>
+        <w:t>Export  ·  Element 7  ·  prompt (c)</w:t>
       </w:r>
     </w:p>
     <w:p>
@@ -3347,7 +1485,7 @@
           <w:color w:val="031522"/>
           <w:sz w:val="22"/>
         </w:rPr>
-        <w:t>Filtered bulk extract — not SELECT star. Open formats: CSV, JSON, Parquet. Schema travels with the file: grant_no, program_area, amount_usd, awardee.</w:t>
+        <w:t>Filtered bulk extract — not every column, every year. Open formats: CSV, JSON, Parquet. Schema travels with the file: grant number, program area, amount, awardee.</w:t>
       </w:r>
     </w:p>
     <w:p>
@@ -3389,7 +1527,7 @@
           <w:color w:val="031522"/>
           <w:sz w:val="22"/>
         </w:rPr>
-        <w:t>app.export_history — who, what, filter, row count. Continuous authorization, not a static password file.</w:t>
+        <w:t>Export history — who, what, filter, row count. Continuous authorization, not a static password file.</w:t>
       </w:r>
     </w:p>
     <w:p>
@@ -3431,7 +1569,7 @@
           <w:color w:val="031522"/>
           <w:sz w:val="22"/>
         </w:rPr>
-        <w:t>This is the live, documented Databricks Statement Execution REST API — POST /api/2.0/sql/statements — OAuth, short-lived token, same warehouse this dashboard uses. That is what Advana or Cloud One would call. It is not a Databricks-only extract and it is not a fictional host.</w:t>
+        <w:t>Execute live Statement API call — that is the documented SQL REST contract. Short-lived token, same warehouse this dashboard uses. That is what Advana or Cloud One would call. It is not a vendor-only extract and it is not a fictional host.</w:t>
       </w:r>
     </w:p>
     <w:p>
@@ -3461,7 +1599,7 @@
           <w:color w:val="031522"/>
           <w:sz w:val="22"/>
         </w:rPr>
-        <w:t>Three planes, same identity. The app has its own service principal; it does not borrow mine. The warehouse and the cluster are separate compute — micro-segmentation at the control plane. Unity Catalog is the data-plane firewall. Least privilege: analysts SELECT gold, they never see bronze. This cell is unclassified mock on commercial AWS — FedRAMP Moderate. The IL5 production cell is GovCloud, PrivateLink, customer-managed KMS, continuous compliance against the same least-privilege grants. We are not claiming this POC is IL5.</w:t>
+        <w:t>Three planes, same identity. The application has its own service principal; it does not borrow mine. The warehouse and the cluster are separate compute — micro-segmentation at the control plane. The catalog is the data-plane firewall. Least privilege: analysts read gold, they never see bronze. This cell is unclassified mock on commercial AWS — FedRAMP Moderate. The IL5 production cell is GovCloud, PrivateLink, customer-managed keys, continuous compliance against the same least-privilege grants. We are not claiming this POC is IL5.</w:t>
       </w:r>
     </w:p>
     <w:p>
@@ -3476,7 +1614,7 @@
           <w:color w:val="031522"/>
           <w:sz w:val="22"/>
         </w:rPr>
-        <w:t>Tomorrow another CSV lands on the same Volume. Same gold. Same registered models — we rescore from this console. Mock data only.</w:t>
+        <w:t>Tomorrow another file lands in the same landing zone. Same gold. Same registered models — we rescore from this console. Mock data only.</w:t>
       </w:r>
     </w:p>
     <w:p>
@@ -3506,1083 +1644,6 @@
         <w:t>Stop talking. Leave Export on screen.</w:t>
       </w:r>
     </w:p>
-    <w:p>
-      <w:pPr>
-        <w:spacing w:before="320" w:after="120"/>
-        <w:pBdr>
-          <w:bottom w:val="single" w:sz="12" w:space="4" w:color="8C6A22"/>
-        </w:pBdr>
-      </w:pPr>
-      <w:r>
-        <w:rPr>
-          <w:rFonts w:ascii="Calibri" w:hAnsi="Calibri"/>
-          <w:b/>
-          <w:i w:val="0"/>
-          <w:color w:val="082B46"/>
-          <w:sz w:val="32"/>
-        </w:rPr>
-        <w:t>Catch-up  ·  if the clock is ahead of you</w:t>
-      </w:r>
-    </w:p>
-    <w:tbl>
-      <w:tblPr>
-        <w:tblStyle w:val="TableGrid"/>
-        <w:tblW w:type="auto" w:w="0"/>
-        <w:jc w:val="center"/>
-        <w:tblLook w:firstColumn="1" w:firstRow="1" w:lastColumn="0" w:lastRow="0" w:noHBand="0" w:noVBand="1" w:val="04A0"/>
-      </w:tblPr>
-      <w:tblGrid>
-        <w:gridCol w:w="4824"/>
-        <w:gridCol w:w="4824"/>
-      </w:tblGrid>
-      <w:tr>
-        <w:tc>
-          <w:tcPr>
-            <w:tcW w:type="dxa" w:w="3744"/>
-            <w:shd w:fill="082B46" w:val="clear"/>
-          </w:tcPr>
-          <w:p>
-            <w:r/>
-            <w:r>
-              <w:rPr>
-                <w:rFonts w:ascii="Calibri" w:hAnsi="Calibri"/>
-                <w:b/>
-                <w:i w:val="0"/>
-                <w:color w:val="FFFFFF"/>
-                <w:sz w:val="20"/>
-              </w:rPr>
-              <w:t>If the clock says</w:t>
-            </w:r>
-          </w:p>
-        </w:tc>
-        <w:tc>
-          <w:tcPr>
-            <w:tcW w:type="dxa" w:w="6192"/>
-            <w:shd w:fill="082B46" w:val="clear"/>
-          </w:tcPr>
-          <w:p>
-            <w:r/>
-            <w:r>
-              <w:rPr>
-                <w:rFonts w:ascii="Calibri" w:hAnsi="Calibri"/>
-                <w:b/>
-                <w:i w:val="0"/>
-                <w:color w:val="FFFFFF"/>
-                <w:sz w:val="20"/>
-              </w:rPr>
-              <w:t>Skip and go to</w:t>
-            </w:r>
-          </w:p>
-        </w:tc>
-      </w:tr>
-      <w:tr>
-        <w:tc>
-          <w:tcPr>
-            <w:tcW w:type="dxa" w:w="3744"/>
-          </w:tcPr>
-          <w:p>
-            <w:r/>
-            <w:r>
-              <w:rPr>
-                <w:rFonts w:ascii="Calibri" w:hAnsi="Calibri"/>
-                <w:b/>
-                <w:i w:val="0"/>
-                <w:color w:val="031522"/>
-                <w:sz w:val="20"/>
-              </w:rPr>
-              <w:t>2:30 and MFA is still spinning</w:t>
-            </w:r>
-          </w:p>
-        </w:tc>
-        <w:tc>
-          <w:tcPr>
-            <w:tcW w:type="dxa" w:w="6192"/>
-          </w:tcPr>
-          <w:p>
-            <w:r/>
-            <w:r>
-              <w:rPr>
-                <w:rFonts w:ascii="Calibri" w:hAnsi="Calibri"/>
-                <w:b w:val="0"/>
-                <w:i w:val="0"/>
-                <w:color w:val="031522"/>
-                <w:sz w:val="20"/>
-              </w:rPr>
-              <w:t>Finish the challenge. Do not skip MFA. Steal time from Catalog Policies later.</w:t>
-            </w:r>
-          </w:p>
-        </w:tc>
-      </w:tr>
-      <w:tr>
-        <w:tc>
-          <w:tcPr>
-            <w:tcW w:type="dxa" w:w="3744"/>
-            <w:shd w:fill="E7EFF4" w:val="clear"/>
-          </w:tcPr>
-          <w:p>
-            <w:r/>
-            <w:r>
-              <w:rPr>
-                <w:rFonts w:ascii="Calibri" w:hAnsi="Calibri"/>
-                <w:b/>
-                <w:i w:val="0"/>
-                <w:color w:val="031522"/>
-                <w:sz w:val="20"/>
-              </w:rPr>
-              <w:t>3:50 still in the repo</w:t>
-            </w:r>
-          </w:p>
-        </w:tc>
-        <w:tc>
-          <w:tcPr>
-            <w:tcW w:type="dxa" w:w="6192"/>
-            <w:shd w:fill="E7EFF4" w:val="clear"/>
-          </w:tcPr>
-          <w:p>
-            <w:r/>
-            <w:r>
-              <w:rPr>
-                <w:rFonts w:ascii="Calibri" w:hAnsi="Calibri"/>
-                <w:b w:val="0"/>
-                <w:i w:val="0"/>
-                <w:color w:val="031522"/>
-                <w:sz w:val="20"/>
-              </w:rPr>
-              <w:t>Do not run deploy again. Say the command. Open Compass on Infrastructure at 4:00.</w:t>
-            </w:r>
-          </w:p>
-        </w:tc>
-      </w:tr>
-      <w:tr>
-        <w:tc>
-          <w:tcPr>
-            <w:tcW w:type="dxa" w:w="3744"/>
-          </w:tcPr>
-          <w:p>
-            <w:r/>
-            <w:r>
-              <w:rPr>
-                <w:rFonts w:ascii="Calibri" w:hAnsi="Calibri"/>
-                <w:b/>
-                <w:i w:val="0"/>
-                <w:color w:val="031522"/>
-                <w:sz w:val="20"/>
-              </w:rPr>
-              <w:t>6:30 and Ingest is still spinning</w:t>
-            </w:r>
-          </w:p>
-        </w:tc>
-        <w:tc>
-          <w:tcPr>
-            <w:tcW w:type="dxa" w:w="6192"/>
-          </w:tcPr>
-          <w:p>
-            <w:r/>
-            <w:r>
-              <w:rPr>
-                <w:rFonts w:ascii="Calibri" w:hAnsi="Calibri"/>
-                <w:b w:val="0"/>
-                <w:i w:val="0"/>
-                <w:color w:val="031522"/>
-                <w:sz w:val="20"/>
-              </w:rPr>
-              <w:t>Keep talking (a). Do not open Quality.</w:t>
-            </w:r>
-          </w:p>
-        </w:tc>
-      </w:tr>
-      <w:tr>
-        <w:tc>
-          <w:tcPr>
-            <w:tcW w:type="dxa" w:w="3744"/>
-            <w:shd w:fill="E7EFF4" w:val="clear"/>
-          </w:tcPr>
-          <w:p>
-            <w:r/>
-            <w:r>
-              <w:rPr>
-                <w:rFonts w:ascii="Calibri" w:hAnsi="Calibri"/>
-                <w:b/>
-                <w:i w:val="0"/>
-                <w:color w:val="031522"/>
-                <w:sz w:val="20"/>
-              </w:rPr>
-              <w:t>9:30 and bronze has not ticked</w:t>
-            </w:r>
-          </w:p>
-        </w:tc>
-        <w:tc>
-          <w:tcPr>
-            <w:tcW w:type="dxa" w:w="6192"/>
-            <w:shd w:fill="E7EFF4" w:val="clear"/>
-          </w:tcPr>
-          <w:p>
-            <w:r/>
-            <w:r>
-              <w:rPr>
-                <w:rFonts w:ascii="Calibri" w:hAnsi="Calibri"/>
-                <w:b w:val="0"/>
-                <w:i w:val="0"/>
-                <w:color w:val="031522"/>
-                <w:sz w:val="20"/>
-              </w:rPr>
-              <w:t>Say the file is on the Volume. Open 01b if needed. At 10:30 go to Catalog anyway.</w:t>
-            </w:r>
-          </w:p>
-        </w:tc>
-      </w:tr>
-      <w:tr>
-        <w:tc>
-          <w:tcPr>
-            <w:tcW w:type="dxa" w:w="3744"/>
-          </w:tcPr>
-          <w:p>
-            <w:r/>
-            <w:r>
-              <w:rPr>
-                <w:rFonts w:ascii="Calibri" w:hAnsi="Calibri"/>
-                <w:b/>
-                <w:i w:val="0"/>
-                <w:color w:val="031522"/>
-                <w:sz w:val="20"/>
-              </w:rPr>
-              <w:t>12:30 still on Catalog</w:t>
-            </w:r>
-          </w:p>
-        </w:tc>
-        <w:tc>
-          <w:tcPr>
-            <w:tcW w:type="dxa" w:w="6192"/>
-          </w:tcPr>
-          <w:p>
-            <w:r/>
-            <w:r>
-              <w:rPr>
-                <w:rFonts w:ascii="Calibri" w:hAnsi="Calibri"/>
-                <w:b w:val="0"/>
-                <w:i w:val="0"/>
-                <w:color w:val="031522"/>
-                <w:sz w:val="20"/>
-              </w:rPr>
-              <w:t>Skip Policies. Say (e) in two sentences. Go to Analytics.</w:t>
-            </w:r>
-          </w:p>
-        </w:tc>
-      </w:tr>
-      <w:tr>
-        <w:tc>
-          <w:tcPr>
-            <w:tcW w:type="dxa" w:w="3744"/>
-            <w:shd w:fill="E7EFF4" w:val="clear"/>
-          </w:tcPr>
-          <w:p>
-            <w:r/>
-            <w:r>
-              <w:rPr>
-                <w:rFonts w:ascii="Calibri" w:hAnsi="Calibri"/>
-                <w:b/>
-                <w:i w:val="0"/>
-                <w:color w:val="031522"/>
-                <w:sz w:val="20"/>
-              </w:rPr>
-              <w:t>16:30 and Score is still running</w:t>
-            </w:r>
-          </w:p>
-        </w:tc>
-        <w:tc>
-          <w:tcPr>
-            <w:tcW w:type="dxa" w:w="6192"/>
-            <w:shd w:fill="E7EFF4" w:val="clear"/>
-          </w:tcPr>
-          <w:p>
-            <w:r/>
-            <w:r>
-              <w:rPr>
-                <w:rFonts w:ascii="Calibri" w:hAnsi="Calibri"/>
-                <w:b w:val="0"/>
-                <w:i w:val="0"/>
-                <w:color w:val="031522"/>
-                <w:sz w:val="20"/>
-              </w:rPr>
-              <w:t>Stay on Analytics. Skip Metrics. Portfolio at 18:00.</w:t>
-            </w:r>
-          </w:p>
-        </w:tc>
-      </w:tr>
-      <w:tr>
-        <w:tc>
-          <w:tcPr>
-            <w:tcW w:type="dxa" w:w="3744"/>
-          </w:tcPr>
-          <w:p>
-            <w:r/>
-            <w:r>
-              <w:rPr>
-                <w:rFonts w:ascii="Calibri" w:hAnsi="Calibri"/>
-                <w:b/>
-                <w:i w:val="0"/>
-                <w:color w:val="031522"/>
-                <w:sz w:val="20"/>
-              </w:rPr>
-              <w:t>19:30 still on Analytics</w:t>
-            </w:r>
-          </w:p>
-        </w:tc>
-        <w:tc>
-          <w:tcPr>
-            <w:tcW w:type="dxa" w:w="6192"/>
-          </w:tcPr>
-          <w:p>
-            <w:r/>
-            <w:r>
-              <w:rPr>
-                <w:rFonts w:ascii="Calibri" w:hAnsi="Calibri"/>
-                <w:b w:val="0"/>
-                <w:i w:val="0"/>
-                <w:color w:val="031522"/>
-                <w:sz w:val="20"/>
-              </w:rPr>
-              <w:t>Skip Anomalies or Forecast — keep one. Go to Portfolio search.</w:t>
-            </w:r>
-          </w:p>
-        </w:tc>
-      </w:tr>
-      <w:tr>
-        <w:tc>
-          <w:tcPr>
-            <w:tcW w:type="dxa" w:w="3744"/>
-            <w:shd w:fill="E7EFF4" w:val="clear"/>
-          </w:tcPr>
-          <w:p>
-            <w:r/>
-            <w:r>
-              <w:rPr>
-                <w:rFonts w:ascii="Calibri" w:hAnsi="Calibri"/>
-                <w:b/>
-                <w:i w:val="0"/>
-                <w:color w:val="031522"/>
-                <w:sz w:val="20"/>
-              </w:rPr>
-              <w:t>21:30 still on Portfolio</w:t>
-            </w:r>
-          </w:p>
-        </w:tc>
-        <w:tc>
-          <w:tcPr>
-            <w:tcW w:type="dxa" w:w="6192"/>
-            <w:shd w:fill="E7EFF4" w:val="clear"/>
-          </w:tcPr>
-          <w:p>
-            <w:r/>
-            <w:r>
-              <w:rPr>
-                <w:rFonts w:ascii="Calibri" w:hAnsi="Calibri"/>
-                <w:b w:val="0"/>
-                <w:i w:val="0"/>
-                <w:color w:val="031522"/>
-                <w:sz w:val="20"/>
-              </w:rPr>
-              <w:t>Skip Budget. Go to Export.</w:t>
-            </w:r>
-          </w:p>
-        </w:tc>
-      </w:tr>
-      <w:tr>
-        <w:tc>
-          <w:tcPr>
-            <w:tcW w:type="dxa" w:w="3744"/>
-          </w:tcPr>
-          <w:p>
-            <w:r/>
-            <w:r>
-              <w:rPr>
-                <w:rFonts w:ascii="Calibri" w:hAnsi="Calibri"/>
-                <w:b/>
-                <w:i w:val="0"/>
-                <w:color w:val="031522"/>
-                <w:sz w:val="20"/>
-              </w:rPr>
-              <w:t>24:00 and no API yet</w:t>
-            </w:r>
-          </w:p>
-        </w:tc>
-        <w:tc>
-          <w:tcPr>
-            <w:tcW w:type="dxa" w:w="6192"/>
-          </w:tcPr>
-          <w:p>
-            <w:r/>
-            <w:r>
-              <w:rPr>
-                <w:rFonts w:ascii="Calibri" w:hAnsi="Calibri"/>
-                <w:b w:val="0"/>
-                <w:i w:val="0"/>
-                <w:color w:val="031522"/>
-                <w:sz w:val="20"/>
-              </w:rPr>
-              <w:t>Skip download. Execute live Statement API immediately. Say (c) in four sentences.</w:t>
-            </w:r>
-          </w:p>
-        </w:tc>
-      </w:tr>
-    </w:tbl>
-    <w:p>
-      <w:pPr>
-        <w:spacing w:after="160"/>
-      </w:pPr>
-    </w:p>
-    <w:p>
-      <w:pPr>
-        <w:spacing w:before="320" w:after="120"/>
-        <w:pBdr>
-          <w:bottom w:val="single" w:sz="12" w:space="4" w:color="8C6A22"/>
-        </w:pBdr>
-      </w:pPr>
-      <w:r>
-        <w:rPr>
-          <w:rFonts w:ascii="Calibri" w:hAnsi="Calibri"/>
-          <w:b/>
-          <w:i w:val="0"/>
-          <w:color w:val="082B46"/>
-          <w:sz w:val="32"/>
-        </w:rPr>
-        <w:t>If something is down  ·  one sentence, then move</w:t>
-      </w:r>
-    </w:p>
-    <w:tbl>
-      <w:tblPr>
-        <w:tblStyle w:val="TableGrid"/>
-        <w:tblW w:type="auto" w:w="0"/>
-        <w:jc w:val="center"/>
-        <w:tblLook w:firstColumn="1" w:firstRow="1" w:lastColumn="0" w:lastRow="0" w:noHBand="0" w:noVBand="1" w:val="04A0"/>
-      </w:tblPr>
-      <w:tblGrid>
-        <w:gridCol w:w="4824"/>
-        <w:gridCol w:w="4824"/>
-      </w:tblGrid>
-      <w:tr>
-        <w:tc>
-          <w:tcPr>
-            <w:tcW w:type="dxa" w:w="3168"/>
-            <w:shd w:fill="082B46" w:val="clear"/>
-          </w:tcPr>
-          <w:p>
-            <w:r/>
-            <w:r>
-              <w:rPr>
-                <w:rFonts w:ascii="Calibri" w:hAnsi="Calibri"/>
-                <w:b/>
-                <w:i w:val="0"/>
-                <w:color w:val="FFFFFF"/>
-                <w:sz w:val="20"/>
-              </w:rPr>
-              <w:t>Symptom</w:t>
-            </w:r>
-          </w:p>
-        </w:tc>
-        <w:tc>
-          <w:tcPr>
-            <w:tcW w:type="dxa" w:w="6768"/>
-            <w:shd w:fill="082B46" w:val="clear"/>
-          </w:tcPr>
-          <w:p>
-            <w:r/>
-            <w:r>
-              <w:rPr>
-                <w:rFonts w:ascii="Calibri" w:hAnsi="Calibri"/>
-                <w:b/>
-                <w:i w:val="0"/>
-                <w:color w:val="FFFFFF"/>
-                <w:sz w:val="20"/>
-              </w:rPr>
-              <w:t>Say, then do</w:t>
-            </w:r>
-          </w:p>
-        </w:tc>
-      </w:tr>
-      <w:tr>
-        <w:tc>
-          <w:tcPr>
-            <w:tcW w:type="dxa" w:w="3168"/>
-          </w:tcPr>
-          <w:p>
-            <w:r/>
-            <w:r>
-              <w:rPr>
-                <w:rFonts w:ascii="Calibri" w:hAnsi="Calibri"/>
-                <w:b/>
-                <w:i w:val="0"/>
-                <w:color w:val="031522"/>
-                <w:sz w:val="20"/>
-              </w:rPr>
-              <w:t>Compass says fixture</w:t>
-            </w:r>
-          </w:p>
-        </w:tc>
-        <w:tc>
-          <w:tcPr>
-            <w:tcW w:type="dxa" w:w="6768"/>
-          </w:tcPr>
-          <w:p>
-            <w:r/>
-            <w:r>
-              <w:rPr>
-                <w:rFonts w:ascii="Calibri" w:hAnsi="Calibri"/>
-                <w:b w:val="0"/>
-                <w:i w:val="0"/>
-                <w:color w:val="031522"/>
-                <w:sz w:val="20"/>
-              </w:rPr>
-              <w:t>Warehouse or app service-principal grant is cold. Do not fake Ingest.</w:t>
-            </w:r>
-          </w:p>
-        </w:tc>
-      </w:tr>
-      <w:tr>
-        <w:tc>
-          <w:tcPr>
-            <w:tcW w:type="dxa" w:w="3168"/>
-            <w:shd w:fill="E7EFF4" w:val="clear"/>
-          </w:tcPr>
-          <w:p>
-            <w:r/>
-            <w:r>
-              <w:rPr>
-                <w:rFonts w:ascii="Calibri" w:hAnsi="Calibri"/>
-                <w:b/>
-                <w:i w:val="0"/>
-                <w:color w:val="031522"/>
-                <w:sz w:val="20"/>
-              </w:rPr>
-              <w:t>Ingest errors</w:t>
-            </w:r>
-          </w:p>
-        </w:tc>
-        <w:tc>
-          <w:tcPr>
-            <w:tcW w:type="dxa" w:w="6768"/>
-            <w:shd w:fill="E7EFF4" w:val="clear"/>
-          </w:tcPr>
-          <w:p>
-            <w:r/>
-            <w:r>
-              <w:rPr>
-                <w:rFonts w:ascii="Calibri" w:hAnsi="Calibri"/>
-                <w:b w:val="0"/>
-                <w:i w:val="0"/>
-                <w:color w:val="031522"/>
-                <w:sz w:val="20"/>
-              </w:rPr>
-              <w:t>I will not debug IAM on camera. Skip to Catalog Open lineage.</w:t>
-            </w:r>
-          </w:p>
-        </w:tc>
-      </w:tr>
-      <w:tr>
-        <w:tc>
-          <w:tcPr>
-            <w:tcW w:type="dxa" w:w="3168"/>
-          </w:tcPr>
-          <w:p>
-            <w:r/>
-            <w:r>
-              <w:rPr>
-                <w:rFonts w:ascii="Calibri" w:hAnsi="Calibri"/>
-                <w:b/>
-                <w:i w:val="0"/>
-                <w:color w:val="031522"/>
-                <w:sz w:val="20"/>
-              </w:rPr>
-              <w:t>Start stream fails</w:t>
-            </w:r>
-          </w:p>
-        </w:tc>
-        <w:tc>
-          <w:tcPr>
-            <w:tcW w:type="dxa" w:w="6768"/>
-          </w:tcPr>
-          <w:p>
-            <w:r/>
-            <w:r>
-              <w:rPr>
-                <w:rFonts w:ascii="Calibri" w:hAnsi="Calibri"/>
-                <w:b w:val="0"/>
-                <w:i w:val="0"/>
-                <w:color w:val="031522"/>
-                <w:sz w:val="20"/>
-              </w:rPr>
-              <w:t>Open stream notebook. Same Volume file. Come back.</w:t>
-            </w:r>
-          </w:p>
-        </w:tc>
-      </w:tr>
-      <w:tr>
-        <w:tc>
-          <w:tcPr>
-            <w:tcW w:type="dxa" w:w="3168"/>
-            <w:shd w:fill="E7EFF4" w:val="clear"/>
-          </w:tcPr>
-          <w:p>
-            <w:r/>
-            <w:r>
-              <w:rPr>
-                <w:rFonts w:ascii="Calibri" w:hAnsi="Calibri"/>
-                <w:b/>
-                <w:i w:val="0"/>
-                <w:color w:val="031522"/>
-                <w:sz w:val="20"/>
-              </w:rPr>
-              <w:t>Bronze does not tick</w:t>
-            </w:r>
-          </w:p>
-        </w:tc>
-        <w:tc>
-          <w:tcPr>
-            <w:tcW w:type="dxa" w:w="6768"/>
-            <w:shd w:fill="E7EFF4" w:val="clear"/>
-          </w:tcPr>
-          <w:p>
-            <w:r/>
-            <w:r>
-              <w:rPr>
-                <w:rFonts w:ascii="Calibri" w:hAnsi="Calibri"/>
-                <w:b w:val="0"/>
-                <w:i w:val="0"/>
-                <w:color w:val="031522"/>
-                <w:sz w:val="20"/>
-              </w:rPr>
-              <w:t>File must sit under landing/grants, not _staged. Then Catalog.</w:t>
-            </w:r>
-          </w:p>
-        </w:tc>
-      </w:tr>
-      <w:tr>
-        <w:tc>
-          <w:tcPr>
-            <w:tcW w:type="dxa" w:w="3168"/>
-          </w:tcPr>
-          <w:p>
-            <w:r/>
-            <w:r>
-              <w:rPr>
-                <w:rFonts w:ascii="Calibri" w:hAnsi="Calibri"/>
-                <w:b/>
-                <w:i w:val="0"/>
-                <w:color w:val="031522"/>
-                <w:sz w:val="20"/>
-              </w:rPr>
-              <w:t>Lineage graph empty</w:t>
-            </w:r>
-          </w:p>
-        </w:tc>
-        <w:tc>
-          <w:tcPr>
-            <w:tcW w:type="dxa" w:w="6768"/>
-          </w:tcPr>
-          <w:p>
-            <w:r/>
-            <w:r>
-              <w:rPr>
-                <w:rFonts w:ascii="Calibri" w:hAnsi="Calibri"/>
-                <w:b w:val="0"/>
-                <w:i w:val="0"/>
-                <w:color w:val="031522"/>
-                <w:sz w:val="20"/>
-              </w:rPr>
-              <w:t>Same graph lives on gold.grants_summary. Do not draw it in Streamlit.</w:t>
-            </w:r>
-          </w:p>
-        </w:tc>
-      </w:tr>
-      <w:tr>
-        <w:tc>
-          <w:tcPr>
-            <w:tcW w:type="dxa" w:w="3168"/>
-            <w:shd w:fill="E7EFF4" w:val="clear"/>
-          </w:tcPr>
-          <w:p>
-            <w:r/>
-            <w:r>
-              <w:rPr>
-                <w:rFonts w:ascii="Calibri" w:hAnsi="Calibri"/>
-                <w:b/>
-                <w:i w:val="0"/>
-                <w:color w:val="031522"/>
-                <w:sz w:val="20"/>
-              </w:rPr>
-              <w:t>Score fails</w:t>
-            </w:r>
-          </w:p>
-        </w:tc>
-        <w:tc>
-          <w:tcPr>
-            <w:tcW w:type="dxa" w:w="6768"/>
-            <w:shd w:fill="E7EFF4" w:val="clear"/>
-          </w:tcPr>
-          <w:p>
-            <w:r/>
-            <w:r>
-              <w:rPr>
-                <w:rFonts w:ascii="Calibri" w:hAnsi="Calibri"/>
-                <w:b w:val="0"/>
-                <w:i w:val="0"/>
-                <w:color w:val="031522"/>
-                <w:sz w:val="20"/>
-              </w:rPr>
-              <w:t>Open scoring notebook. I will not train on camera. Last night’s gold tables.</w:t>
-            </w:r>
-          </w:p>
-        </w:tc>
-      </w:tr>
-      <w:tr>
-        <w:tc>
-          <w:tcPr>
-            <w:tcW w:type="dxa" w:w="3168"/>
-          </w:tcPr>
-          <w:p>
-            <w:r/>
-            <w:r>
-              <w:rPr>
-                <w:rFonts w:ascii="Calibri" w:hAnsi="Calibri"/>
-                <w:b/>
-                <w:i w:val="0"/>
-                <w:color w:val="031522"/>
-                <w:sz w:val="20"/>
-              </w:rPr>
-              <w:t>Brief is the template</w:t>
-            </w:r>
-          </w:p>
-        </w:tc>
-        <w:tc>
-          <w:tcPr>
-            <w:tcW w:type="dxa" w:w="6768"/>
-          </w:tcPr>
-          <w:p>
-            <w:r/>
-            <w:r>
-              <w:rPr>
-                <w:rFonts w:ascii="Calibri" w:hAnsi="Calibri"/>
-                <w:b w:val="0"/>
-                <w:i w:val="0"/>
-                <w:color w:val="031522"/>
-                <w:sz w:val="20"/>
-              </w:rPr>
-              <w:t>Foundation Models are off. The structured brief still writes app.daily_briefs.</w:t>
-            </w:r>
-          </w:p>
-        </w:tc>
-      </w:tr>
-      <w:tr>
-        <w:tc>
-          <w:tcPr>
-            <w:tcW w:type="dxa" w:w="3168"/>
-            <w:shd w:fill="E7EFF4" w:val="clear"/>
-          </w:tcPr>
-          <w:p>
-            <w:r/>
-            <w:r>
-              <w:rPr>
-                <w:rFonts w:ascii="Calibri" w:hAnsi="Calibri"/>
-                <w:b/>
-                <w:i w:val="0"/>
-                <w:color w:val="031522"/>
-                <w:sz w:val="20"/>
-              </w:rPr>
-              <w:t>Statement API fails</w:t>
-            </w:r>
-          </w:p>
-        </w:tc>
-        <w:tc>
-          <w:tcPr>
-            <w:tcW w:type="dxa" w:w="6768"/>
-            <w:shd w:fill="E7EFF4" w:val="clear"/>
-          </w:tcPr>
-          <w:p>
-            <w:r/>
-            <w:r>
-              <w:rPr>
-                <w:rFonts w:ascii="Calibri" w:hAnsi="Calibri"/>
-                <w:b w:val="0"/>
-                <w:i w:val="0"/>
-                <w:color w:val="031522"/>
-                <w:sz w:val="20"/>
-              </w:rPr>
-              <w:t>Same SQL on the warehouse cursor — still live. The curl is the Advana contract.</w:t>
-            </w:r>
-          </w:p>
-        </w:tc>
-      </w:tr>
-      <w:tr>
-        <w:tc>
-          <w:tcPr>
-            <w:tcW w:type="dxa" w:w="3168"/>
-          </w:tcPr>
-          <w:p>
-            <w:r/>
-            <w:r>
-              <w:rPr>
-                <w:rFonts w:ascii="Calibri" w:hAnsi="Calibri"/>
-                <w:b/>
-                <w:i w:val="0"/>
-                <w:color w:val="031522"/>
-                <w:sz w:val="20"/>
-              </w:rPr>
-              <w:t>Widget clears on rerun</w:t>
-            </w:r>
-          </w:p>
-        </w:tc>
-        <w:tc>
-          <w:tcPr>
-            <w:tcW w:type="dxa" w:w="6768"/>
-          </w:tcPr>
-          <w:p>
-            <w:r/>
-            <w:r>
-              <w:rPr>
-                <w:rFonts w:ascii="Calibri" w:hAnsi="Calibri"/>
-                <w:b w:val="0"/>
-                <w:i w:val="0"/>
-                <w:color w:val="031522"/>
-                <w:sz w:val="20"/>
-              </w:rPr>
-              <w:t>Re-select. Do not Restore baseline.</w:t>
-            </w:r>
-          </w:p>
-        </w:tc>
-      </w:tr>
-    </w:tbl>
-    <w:p>
-      <w:pPr>
-        <w:spacing w:after="160"/>
-      </w:pPr>
-    </w:p>
-    <w:p>
-      <w:pPr>
-        <w:spacing w:before="320" w:after="120"/>
-        <w:pBdr>
-          <w:bottom w:val="single" w:sz="12" w:space="4" w:color="8C6A22"/>
-        </w:pBdr>
-      </w:pPr>
-      <w:r>
-        <w:rPr>
-          <w:rFonts w:ascii="Calibri" w:hAnsi="Calibri"/>
-          <w:b/>
-          <w:i w:val="0"/>
-          <w:color w:val="082B46"/>
-          <w:sz w:val="32"/>
-        </w:rPr>
-        <w:t>What you will not say</w:t>
-      </w:r>
-    </w:p>
-    <w:p>
-      <w:pPr>
-        <w:pStyle w:val="ListBullet"/>
-        <w:spacing w:after="40"/>
-      </w:pPr>
-      <w:r>
-        <w:rPr>
-          <w:rFonts w:ascii="Calibri" w:hAnsi="Calibri"/>
-          <w:b w:val="0"/>
-          <w:i w:val="0"/>
-          <w:color w:val="031522"/>
-          <w:sz w:val="22"/>
-        </w:rPr>
-        <w:t>This POC is IL5 or FedRAMP High.</w:t>
-      </w:r>
-    </w:p>
-    <w:p>
-      <w:pPr>
-        <w:pStyle w:val="ListBullet"/>
-        <w:spacing w:after="40"/>
-      </w:pPr>
-      <w:r>
-        <w:rPr>
-          <w:rFonts w:ascii="Calibri" w:hAnsi="Calibri"/>
-          <w:b w:val="0"/>
-          <w:i w:val="0"/>
-          <w:color w:val="031522"/>
-          <w:sz w:val="22"/>
-        </w:rPr>
-        <w:t>The forecast is Prophet or a neural net. It is OLS.</w:t>
-      </w:r>
-    </w:p>
-    <w:p>
-      <w:pPr>
-        <w:pStyle w:val="ListBullet"/>
-        <w:spacing w:after="40"/>
-      </w:pPr>
-      <w:r>
-        <w:rPr>
-          <w:rFonts w:ascii="Calibri" w:hAnsi="Calibri"/>
-          <w:b w:val="0"/>
-          <w:i w:val="0"/>
-          <w:color w:val="031522"/>
-          <w:sz w:val="22"/>
-        </w:rPr>
-        <w:t>The stream is Amazon Kinesis. It is a Unity Catalog Volume plus Auto Loader.</w:t>
-      </w:r>
-    </w:p>
-    <w:p>
-      <w:pPr>
-        <w:pStyle w:val="ListBullet"/>
-        <w:spacing w:after="40"/>
-      </w:pPr>
-      <w:r>
-        <w:rPr>
-          <w:rFonts w:ascii="Calibri" w:hAnsi="Calibri"/>
-          <w:b w:val="0"/>
-          <w:i w:val="0"/>
-          <w:color w:val="031522"/>
-          <w:sz w:val="22"/>
-        </w:rPr>
-        <w:t>Lineage is drawn inside Streamlit. Native lineage is Catalog Explorer.</w:t>
-      </w:r>
-    </w:p>
-    <w:p>
-      <w:pPr>
-        <w:pStyle w:val="ListBullet"/>
-        <w:spacing w:after="40"/>
-      </w:pPr>
-      <w:r>
-        <w:rPr>
-          <w:rFonts w:ascii="Calibri" w:hAnsi="Calibri"/>
-          <w:b w:val="0"/>
-          <w:i w:val="0"/>
-          <w:color w:val="031522"/>
-          <w:sz w:val="22"/>
-        </w:rPr>
-        <w:t>We trained the models just now. You scored from the registry. Training was last night.</w:t>
-      </w:r>
-    </w:p>
-    <w:p>
-      <w:pPr>
-        <w:pStyle w:val="ListBullet"/>
-        <w:spacing w:after="40"/>
-      </w:pPr>
-      <w:r>
-        <w:rPr>
-          <w:rFonts w:ascii="Calibri" w:hAnsi="Calibri"/>
-          <w:b w:val="0"/>
-          <w:i w:val="0"/>
-          <w:color w:val="031522"/>
-          <w:sz w:val="22"/>
-        </w:rPr>
-        <w:t>Drift is accuracy decay. It is feature and score mix versus the baseline snapshot.</w:t>
-      </w:r>
-    </w:p>
-    <w:p>
-      <w:pPr>
-        <w:pStyle w:val="ListBullet"/>
-        <w:spacing w:after="40"/>
-      </w:pPr>
-      <w:r>
-        <w:rPr>
-          <w:rFonts w:ascii="Calibri" w:hAnsi="Calibri"/>
-          <w:b w:val="0"/>
-          <w:i w:val="0"/>
-          <w:color w:val="031522"/>
-          <w:sz w:val="22"/>
-        </w:rPr>
-        <w:t>We rewrite the legacy estate. Strangler-fig only.</w:t>
-      </w:r>
-    </w:p>
-    <w:p>
-      <w:pPr>
-        <w:pStyle w:val="ListBullet"/>
-        <w:spacing w:after="40"/>
-      </w:pPr>
-      <w:r>
-        <w:rPr>
-          <w:rFonts w:ascii="Calibri" w:hAnsi="Calibri"/>
-          <w:b w:val="0"/>
-          <w:i w:val="0"/>
-          <w:color w:val="031522"/>
-          <w:sz w:val="22"/>
-        </w:rPr>
-        <w:t>MFA is this Compass form. MFA is the IdP — you already did it.</w:t>
-      </w:r>
-    </w:p>
-    <w:p>
-      <w:pPr>
-        <w:pStyle w:val="ListBullet"/>
-        <w:spacing w:after="40"/>
-      </w:pPr>
-      <w:r>
-        <w:rPr>
-          <w:rFonts w:ascii="Calibri" w:hAnsi="Calibri"/>
-          <w:b w:val="0"/>
-          <w:i w:val="0"/>
-          <w:color w:val="031522"/>
-          <w:sz w:val="22"/>
-        </w:rPr>
-        <w:t>I am deploying from this button. There is no deploy button. Deploy was databricks bundle deploy -t poc.</w:t>
-      </w:r>
-    </w:p>
-    <w:p>
-      <w:pPr>
-        <w:pStyle w:val="ListBullet"/>
-        <w:spacing w:after="40"/>
-      </w:pPr>
-      <w:r>
-        <w:rPr>
-          <w:rFonts w:ascii="Calibri" w:hAnsi="Calibri"/>
-          <w:b w:val="0"/>
-          <w:i w:val="0"/>
-          <w:color w:val="031522"/>
-          <w:sz w:val="22"/>
-        </w:rPr>
-        <w:t>Any second pass through Home. You entered on Infrastructure.</w:t>
-      </w:r>
-    </w:p>
-    <w:p>
-      <w:pPr>
-        <w:spacing w:before="320" w:after="120"/>
-        <w:pBdr>
-          <w:bottom w:val="single" w:sz="12" w:space="4" w:color="8C6A22"/>
-        </w:pBdr>
-      </w:pPr>
-      <w:r>
-        <w:rPr>
-          <w:rFonts w:ascii="Calibri" w:hAnsi="Calibri"/>
-          <w:b/>
-          <w:i w:val="0"/>
-          <w:color w:val="082B46"/>
-          <w:sz w:val="32"/>
-        </w:rPr>
-        <w:t>Close</w:t>
-      </w:r>
-    </w:p>
-    <w:p>
-      <w:pPr>
-        <w:spacing w:after="160" w:before="0" w:line="276" w:lineRule="auto"/>
-      </w:pPr>
-      <w:r>
-        <w:rPr>
-          <w:rFonts w:ascii="Calibri" w:hAnsi="Calibri"/>
-          <w:b w:val="0"/>
-          <w:i w:val="0"/>
-          <w:color w:val="031522"/>
-          <w:sz w:val="22"/>
-        </w:rPr>
-        <w:t>You have executed all seven scenario elements and narrated all five strategic prompts. Element 1 and most of Element 2 were live before Compass. Compass carried the Element 2 inventory and Elements 3 through 7. Stop on Export. Do not keep talking.</w:t>
-      </w:r>
-    </w:p>
-    <w:p>
-      <w:pPr>
-        <w:spacing w:after="160" w:before="360" w:line="276" w:lineRule="auto"/>
-        <w:jc w:val="center"/>
-      </w:pPr>
-      <w:r>
-        <w:rPr>
-          <w:rFonts w:ascii="Calibri" w:hAnsi="Calibri"/>
-          <w:b/>
-          <w:i w:val="0"/>
-          <w:color w:val="8C6A22"/>
-          <w:sz w:val="20"/>
-        </w:rPr>
-        <w:t>UNCLASSIFIED  //  MOCK DATA</w:t>
-      </w:r>
-    </w:p>
     <w:sectPr>
       <w:headerReference w:type="default" r:id="rId9"/>
       <w:footerReference w:type="default" r:id="rId10"/>
@@ -4610,7 +1671,7 @@
         <w:color w:val="5B6B80"/>
         <w:sz w:val="18"/>
       </w:rPr>
-      <w:t xml:space="preserve">Databricks speaker script  ·  25 minutes  ·  one Key Personnel  ·  page </w:t>
+      <w:t xml:space="preserve">Project Compass speaker script  ·  Elements 3–7  ·  page </w:t>
     </w:r>
     <w:r>
       <w:fldChar w:fldCharType="begin"/>
@@ -4647,7 +1708,7 @@
         <w:color w:val="8C6A22"/>
         <w:sz w:val="18"/>
       </w:rPr>
-      <w:t>UNCLASSIFIED  //  MOCK DATA  ·  ONR ITSS Factor 3  ·  Databricks / Project Compass</w:t>
+      <w:t>ONR ITSS Factor 3  ·  Project Compass  ·  Code 08 portfolio</w:t>
     </w:r>
   </w:p>
 </w:hdr>

</xml_diff>

<commit_message>
Make the Compass speaker script a natural word-for-word walkthrough
Keep every click and every Element 2–7 / prompt (a)–(e) beat. Rewrite spoken lines as one continuous colleague walkthrough instead of labeled briefing cards.
</commit_message>
<xml_diff>
--- a/ONR_ITSS_Databricks_Speaker_Script.docx
+++ b/ONR_ITSS_Databricks_Speaker_Script.docx
@@ -63,7 +63,7 @@
           <w:color w:val="031522"/>
           <w:sz w:val="22"/>
         </w:rPr>
-        <w:t>One Key Personnel  ·  live console  ·  no slides  ·  mock data only</w:t>
+        <w:t>Word-for-word  ·  roman is what you say  ·  gold is what you click</w:t>
       </w:r>
     </w:p>
     <w:p>
@@ -285,7 +285,7 @@
           <w:color w:val="031522"/>
           <w:sz w:val="22"/>
         </w:rPr>
-        <w:t>This is Project Compass, the Code 08 portfolio console. Four hundred synthetic grants, four hundred thirty-seven million dollars. Everything on this tape is mock data. No CUI, no PII, no classified.</w:t>
+        <w:t>This is Project Compass — Code 08’s portfolio console. Four hundred synthetic grants, about four hundred thirty-seven million dollars. All mock. No CUI, no PII, nothing classified. Let me show you the estate real quick, then we’ll take a file.</w:t>
       </w:r>
     </w:p>
     <w:p>
@@ -372,22 +372,7 @@
           <w:color w:val="031522"/>
           <w:sz w:val="22"/>
         </w:rPr>
-        <w:t>Element two: infrastructure as code.</w:t>
-      </w:r>
-    </w:p>
-    <w:p>
-      <w:pPr>
-        <w:spacing w:after="160" w:before="0" w:line="276" w:lineRule="auto"/>
-      </w:pPr>
-      <w:r>
-        <w:rPr>
-          <w:rFonts w:ascii="Calibri" w:hAnsi="Calibri"/>
-          <w:b w:val="0"/>
-          <w:i w:val="0"/>
-          <w:color w:val="031522"/>
-          <w:sz w:val="22"/>
-        </w:rPr>
-        <w:t>This page is the inventory of the estate that was deployed from version control. It is not a second provision. The warehouse serves this console. The score cluster is dedicated to the application identity, not to me. File-arrival is paused. There is no Deploy button in this console. Configuration is reviewed in Git, not clicked here.</w:t>
+        <w:t>Quick beat on Element two. This is the inventory of what we deployed from version control — we didn’t provision it from this screen. Warehouse serving the console. Score cluster dedicated to the application identity, not to me. File-arrival is paused. There’s no Deploy button in here. Config gets reviewed in Git, not clicked in a console. File’s waiting — let’s take it.</w:t>
       </w:r>
     </w:p>
     <w:p>
@@ -447,22 +432,7 @@
           <w:color w:val="031522"/>
           <w:sz w:val="22"/>
         </w:rPr>
-        <w:t>Element three: automated ingestion, data operations, and streaming.</w:t>
-      </w:r>
-    </w:p>
-    <w:p>
-      <w:pPr>
-        <w:spacing w:after="160" w:before="0" w:line="276" w:lineRule="auto"/>
-      </w:pPr>
-      <w:r>
-        <w:rPr>
-          <w:rFonts w:ascii="Calibri" w:hAnsi="Calibri"/>
-          <w:b w:val="0"/>
-          <w:i w:val="0"/>
-          <w:color w:val="031522"/>
-          <w:sz w:val="22"/>
-        </w:rPr>
-        <w:t>A new grants file has arrived. I am not recoding a pipeline. Inbound grants is the good file. Quarantine sample is three bad rows — empty grant number, negative amount, and a duplicate.</w:t>
+        <w:t>Element three is data operations. A grants file showed up. I’m not recoding a pipeline to take it. Inbound grants is the good file. Quarantine sample is the three bad rows — empty grant number, negative amount, and a duplicate. I’ll take both so you can see publish and hold in the same pass.</w:t>
       </w:r>
     </w:p>
     <w:p>
@@ -504,22 +474,7 @@
           <w:color w:val="031522"/>
           <w:sz w:val="22"/>
         </w:rPr>
-        <w:t>Strategic prompt (a) — sustainment of the legacy footprint.</w:t>
-      </w:r>
-    </w:p>
-    <w:p>
-      <w:pPr>
-        <w:spacing w:after="160" w:before="0" w:line="276" w:lineRule="auto"/>
-      </w:pPr>
-      <w:r>
-        <w:rPr>
-          <w:rFonts w:ascii="Calibri" w:hAnsi="Calibri"/>
-          <w:b w:val="0"/>
-          <w:i w:val="0"/>
-          <w:color w:val="031522"/>
-          <w:sz w:val="22"/>
-        </w:rPr>
-        <w:t>We do not cut over the D-and-A Portal, the reporting stack, or the existing ETL in a weekend. The pattern is strangler-fig coexistence. New files land in a governed landing zone. Both the path this button just used and the file-arrival path I will start next write the same bronze table — the landing table. Legacy reports keep reading the serving layer over a standard connection. When a report is ready to retire, we point it at the table this console already uses. Rollback is delete-the-batch, not rewrite-the-estate.</w:t>
+        <w:t>While that’s landing — this is prompt (a), the legacy footprint. We’re not cutting over the D-and-A Portal, the reporting stack, or the existing ETL this weekend. Strangler-fig. New files go to a governed landing zone. This button and the file-arrival path I’m about to start both write the same bronze table. Legacy reports keep reading the serving layer over a standard connection. When a report’s ready to retire, we point it at the table this console already uses. Rollback is delete-the-batch, not rewrite-the-estate.</w:t>
       </w:r>
     </w:p>
     <w:p>
@@ -561,7 +516,7 @@
           <w:color w:val="031522"/>
           <w:sz w:val="22"/>
         </w:rPr>
-        <w:t>Eight rows published. The three quarantine rows never entered the landing table — they are held. One live grant published with a warning, missing abstract. Quality is the tab if a reviewer wants the scoreboard. We do not need it here.</w:t>
+        <w:t>There it is. Eight published. Those three never entered landing — they’re held. Empty, dup, amt. One of the live grants went through with a warning, missing abstract. Quality tab’s there if you want the scoreboard. We don’t need it.</w:t>
       </w:r>
     </w:p>
     <w:p>
@@ -576,7 +531,7 @@
           <w:color w:val="031522"/>
           <w:sz w:val="22"/>
         </w:rPr>
-        <w:t>Same Element three. That button was the warehouse path. Next is file arrival. I am not leaving this console.</w:t>
+        <w:t>Same Element three. That was the warehouse path. Next is file arrival. I’m staying right here.</w:t>
       </w:r>
     </w:p>
     <w:p>
@@ -618,7 +573,7 @@
           <w:color w:val="031522"/>
           <w:sz w:val="22"/>
         </w:rPr>
-        <w:t>The console just landed a new file and loaded it into the same bronze table. That is file-arrival, not a scheduled batch. Open stream notebook is there if a reviewer wants the job. We do not wait on a cold start.</w:t>
+        <w:t>Console just dropped a new file into the landing zone and loaded it into the same bronze table. That’s file-arrival, not a scheduled batch. Open stream notebook is there if you want the job. We’re not waiting on a cold start.</w:t>
       </w:r>
     </w:p>
     <w:p>
@@ -660,7 +615,7 @@
           <w:color w:val="031522"/>
           <w:sz w:val="22"/>
         </w:rPr>
-        <w:t>Bronze ticks. Silver — the trusted table — stays at four hundred and eight because it dedupes on grant number. The serving layer does not double-count the same award.</w:t>
+        <w:t>Bronze ticks. Silver — the trusted table — stays at four hundred and eight. It dedupes on grant number, so we don’t double-count the same award.</w:t>
       </w:r>
     </w:p>
     <w:p>
@@ -675,22 +630,7 @@
           <w:color w:val="031522"/>
           <w:sz w:val="22"/>
         </w:rPr>
-        <w:t>Strategic prompt (d) — disaster recovery, resilience, and failover.</w:t>
-      </w:r>
-    </w:p>
-    <w:p>
-      <w:pPr>
-        <w:spacing w:after="160" w:before="0" w:line="276" w:lineRule="auto"/>
-      </w:pPr>
-      <w:r>
-        <w:rPr>
-          <w:rFonts w:ascii="Calibri" w:hAnsi="Calibri"/>
-          <w:b w:val="0"/>
-          <w:i w:val="0"/>
-          <w:color w:val="031522"/>
-          <w:sz w:val="22"/>
-        </w:rPr>
-        <w:t>Contract targets: RPO fifteen minutes for the serving layer, essentially zero for landing — the file is still sitting in object storage. Time travel is the row-level RPO — baseline snapshot versus now. We are not restoring on camera. RTO thirty minutes to serving gold, about five minutes to serving the app. Annual DR is non-disruptive: pause file-arrival, restore yesterday’s gold into a side catalog, point a clone of the console at it, validate, tear down.</w:t>
+        <w:t>That’s also prompt (d), disaster recovery. Contract is RPO fifteen minutes on the serving layer, essentially zero on landing, because the file’s still sitting in object storage. Time travel is the row-level RPO — baseline versus now. We’re not restoring on camera. RTO thirty minutes to serving gold, about five to serving the app. Annual DR is non-disruptive: pause file-arrival, restore yesterday’s gold into a side catalog, point a clone of the console at it, validate, tear down. Let’s look at lineage on those eight.</w:t>
       </w:r>
     </w:p>
     <w:p>
@@ -750,7 +690,7 @@
           <w:color w:val="031522"/>
           <w:sz w:val="22"/>
         </w:rPr>
-        <w:t>Element four: data governance, quality, and cataloging.</w:t>
+        <w:t>Element four is governance. I want you to see the graph, not a picture we drew in this console.</w:t>
       </w:r>
     </w:p>
     <w:p>
@@ -792,7 +732,7 @@
           <w:color w:val="031522"/>
           <w:sz w:val="22"/>
         </w:rPr>
-        <w:t>Open lineage is the catalog’s native graph — landing, to bronze, to silver, to gold, to this console. That graph is the Element four visual. This console is the operator surface, not the system of record.</w:t>
+        <w:t>That’s the catalog’s own graph. Landing, bronze, silver, gold, this console. That’s the Element four visual. This screen is the operator surface, not the system of record.</w:t>
       </w:r>
     </w:p>
     <w:p>
@@ -834,7 +774,7 @@
           <w:color w:val="031522"/>
           <w:sz w:val="22"/>
         </w:rPr>
-        <w:t>Four schemas. The eight grants we just ingested are already registered. Metadata — source file, ingest time, tags — is on the table, not in a spreadsheet.</w:t>
+        <w:t>Four schemas. The eight we just took in are already registered. Source file, ingest time, tags — on the table, not in a spreadsheet.</w:t>
       </w:r>
     </w:p>
     <w:p>
@@ -876,7 +816,7 @@
           <w:color w:val="031522"/>
           <w:sz w:val="22"/>
         </w:rPr>
-        <w:t>Completeness, accuracy, consistency, timeliness. A lapsed vendor feed shows up here as a timeliness drop, not a blank dashboard.</w:t>
+        <w:t>Completeness, accuracy, consistency, timeliness. If a vendor feed lapses, you see it here as a timeliness drop — not a blank dashboard.</w:t>
       </w:r>
     </w:p>
     <w:p>
@@ -918,22 +858,7 @@
           <w:color w:val="031522"/>
           <w:sz w:val="22"/>
         </w:rPr>
-        <w:t>Strategic prompt (e) — data vendor and lifecycle management.</w:t>
-      </w:r>
-    </w:p>
-    <w:p>
-      <w:pPr>
-        <w:spacing w:after="160" w:before="0" w:line="276" w:lineRule="auto"/>
-      </w:pPr>
-      <w:r>
-        <w:rPr>
-          <w:rFonts w:ascii="Calibri" w:hAnsi="Calibri"/>
-          <w:b w:val="0"/>
-          <w:i w:val="0"/>
-          <w:color w:val="031522"/>
-          <w:sz w:val="22"/>
-        </w:rPr>
-        <w:t>Every external feed is a licensed product: owner, renewal date, quality SLO. Today the tags are data_source, domain, data_sensitivity. In production we add vendor, license_id, renewal_date. Usage is metered on every search and every export. If a subscription stops, nothing new lands. Last-good gold stays. We do not auto-delete.</w:t>
+        <w:t>And that’s prompt (e), vendor and lifecycle. Every external feed is a licensed product — owner, renewal date, quality SLO. Today the tags are data_source, domain, data_sensitivity. In production we add vendor, license_id, renewal_date. Usage is metered on every search and every export. If a subscription stops, nothing new lands. Last-good gold stays. We don’t auto-delete. Let’s score what we just took in.</w:t>
       </w:r>
     </w:p>
     <w:p>
@@ -993,22 +918,7 @@
           <w:color w:val="031522"/>
           <w:sz w:val="22"/>
         </w:rPr>
-        <w:t>Element five: decision-support analytics and modeling.</w:t>
-      </w:r>
-    </w:p>
-    <w:p>
-      <w:pPr>
-        <w:spacing w:after="160" w:before="0" w:line="276" w:lineRule="auto"/>
-      </w:pPr>
-      <w:r>
-        <w:rPr>
-          <w:rFonts w:ascii="Calibri" w:hAnsi="Calibri"/>
-          <w:b w:val="0"/>
-          <w:i w:val="0"/>
-          <w:color w:val="031522"/>
-          <w:sz w:val="22"/>
-        </w:rPr>
-        <w:t>The models were trained last night and registered in the catalog. I am not retraining on camera. I am triggering a live score against the portfolio we just ingested — including the eight new grants.</w:t>
+        <w:t>Element five is decision support. Models were trained last night and registered in the catalog. I’m not retraining. I’m scoring the portfolio we just ingested — including those eight.</w:t>
       </w:r>
     </w:p>
     <w:p>
@@ -1050,7 +960,7 @@
           <w:color w:val="031522"/>
           <w:sz w:val="22"/>
         </w:rPr>
-        <w:t>Score registered models — that button scores the current portfolio from models already in the catalog. It does not train.</w:t>
+        <w:t>That button scores from models already in the catalog. It doesn’t train. While it runs — this is prompt (b), financial and budgetary integration. Execution is a first-class feed. Twelve hundred ERP lines: budget, actual, execution rate. Three models, all on this same portfolio, not a second dataset.</w:t>
       </w:r>
     </w:p>
     <w:p>
@@ -1065,7 +975,7 @@
           <w:color w:val="031522"/>
           <w:sz w:val="22"/>
         </w:rPr>
-        <w:t>Strategic prompt (b) — financial and budgetary analytical integration.</w:t>
+        <w:t>Descriptive is the page a resource officer actually opens — dollars, execution, ON_TARGET, WARNING, AT_RISK. That’s Portfolio, next.</w:t>
       </w:r>
     </w:p>
     <w:p>
@@ -1080,37 +990,7 @@
           <w:color w:val="031522"/>
           <w:sz w:val="22"/>
         </w:rPr>
-        <w:t>Financial execution is a first-class feed: twelve hundred ERP lines — budget, actual, execution rate. Three complementary models, all on this ingested portfolio, not a second dataset.</w:t>
-      </w:r>
-    </w:p>
-    <w:p>
-      <w:pPr>
-        <w:spacing w:after="160" w:before="0" w:line="276" w:lineRule="auto"/>
-      </w:pPr>
-      <w:r>
-        <w:rPr>
-          <w:rFonts w:ascii="Calibri" w:hAnsi="Calibri"/>
-          <w:b w:val="0"/>
-          <w:i w:val="0"/>
-          <w:color w:val="031522"/>
-          <w:sz w:val="22"/>
-        </w:rPr>
-        <w:t>Descriptive: the Portfolio page a Code 08 resource officer opens — dollars, execution, ON_TARGET, WARNING, AT_RISK.</w:t>
-      </w:r>
-    </w:p>
-    <w:p>
-      <w:pPr>
-        <w:spacing w:after="160" w:before="0" w:line="276" w:lineRule="auto"/>
-      </w:pPr>
-      <w:r>
-        <w:rPr>
-          <w:rFonts w:ascii="Calibri" w:hAnsi="Calibri"/>
-          <w:b w:val="0"/>
-          <w:i w:val="0"/>
-          <w:color w:val="031522"/>
-          <w:sz w:val="22"/>
-        </w:rPr>
-        <w:t>Predictive: a Random Forest large-award classifier — Fund, Review, or Defer. An IsolationForest for budget spike, execution collapse, and low-return concentration. And ordinary least squares, two-year horizon, ninety-five percent band, trend IDs TREND-ACCEL, TREND-STEADY, TREND-DECLINE. That is OLS, not Prophet.</w:t>
+        <w:t>Predictive: a Random Forest that returns Fund, Review, or Defer on large awards. An IsolationForest for budget spike, execution collapse, and low-return concentration. And ordinary least squares — two-year horizon, ninety-five percent band, TREND-ACCEL, TREND-STEADY, TREND-DECLINE. That’s OLS, not Prophet.</w:t>
       </w:r>
     </w:p>
     <w:p>
@@ -1167,7 +1047,7 @@
           <w:color w:val="031522"/>
           <w:sz w:val="22"/>
         </w:rPr>
-        <w:t>That is feature and score mix versus the baseline snapshot, not a fake accuracy drop. The live grants moved the mix.</w:t>
+        <w:t>That’s feature and score mix versus the baseline snapshot — not a fake accuracy drop. The live grants moved the mix.</w:t>
       </w:r>
     </w:p>
     <w:p>
@@ -1209,7 +1089,7 @@
           <w:color w:val="031522"/>
           <w:sz w:val="22"/>
         </w:rPr>
-        <w:t>The Resource action sentence is the close a resource officer would sign — Defer dollars off one area onto AT_RISK plus TREND-DECLINE. The declining program is the reallocation candidate on the next page.</w:t>
+        <w:t>Resource action is the sentence a resource officer would sign — Defer dollars off one area onto AT_RISK plus TREND-DECLINE. That declining program is the reallocation candidate. Let’s look at it the way they would.</w:t>
       </w:r>
     </w:p>
     <w:p>
@@ -1269,22 +1149,7 @@
           <w:color w:val="031522"/>
           <w:sz w:val="22"/>
         </w:rPr>
-        <w:t>Element six: unified dashboard, visualizations, and process automation.</w:t>
-      </w:r>
-    </w:p>
-    <w:p>
-      <w:pPr>
-        <w:spacing w:after="160" w:before="0" w:line="276" w:lineRule="auto"/>
-      </w:pPr>
-      <w:r>
-        <w:rPr>
-          <w:rFonts w:ascii="Calibri" w:hAnsi="Calibri"/>
-          <w:b w:val="0"/>
-          <w:i w:val="0"/>
-          <w:color w:val="031522"/>
-          <w:sz w:val="22"/>
-        </w:rPr>
-        <w:t>A non-technical leader does not need SQL. Active grants is still four hundred and eight.</w:t>
+        <w:t>Element six — this is the officer view. Nobody here needs SQL. Active grants is still four hundred and eight.</w:t>
       </w:r>
     </w:p>
     <w:p>
@@ -1326,7 +1191,7 @@
           <w:color w:val="031522"/>
           <w:sz w:val="22"/>
         </w:rPr>
-        <w:t>Search is live against the serving layer. It is written to the search history. That is the audit Zero Trust asked for, and it is the usage meter for prompt (e).</w:t>
+        <w:t>Search is live against the serving layer, and it writes a history row. That’s the audit Zero Trust asked for, and it’s the usage meter for prompt (e).</w:t>
       </w:r>
     </w:p>
     <w:p>
@@ -1368,7 +1233,7 @@
           <w:color w:val="031522"/>
           <w:sz w:val="22"/>
         </w:rPr>
-        <w:t>Generate daily brief — automated summary. Classification banner, three bullets, one recommended action. A row lands in the brief log. That is process automation — not a staffer writing the morning book.</w:t>
+        <w:t>That’s the morning book, without a staffer writing it. Classification banner, three bullets, one recommended action. A row lands in the brief log.</w:t>
       </w:r>
     </w:p>
     <w:p>
@@ -1410,7 +1275,7 @@
           <w:color w:val="031522"/>
           <w:sz w:val="22"/>
         </w:rPr>
-        <w:t>Same serving layer the forecast used. AT_RISK plus TREND-DECLINE is the reallocation set. Extract is next.</w:t>
+        <w:t>Same serving layer the forecast used. AT_RISK plus TREND-DECLINE is the reallocation set. Last stop — get it out of here in an open format.</w:t>
       </w:r>
     </w:p>
     <w:p>
@@ -1443,7 +1308,7 @@
           <w:color w:val="031522"/>
           <w:sz w:val="22"/>
         </w:rPr>
-        <w:t>Element seven: interoperability, data portability, and secure export.</w:t>
+        <w:t>Element seven is interoperability. Filtered extract — not every column, every year.</w:t>
       </w:r>
     </w:p>
     <w:p>
@@ -1485,7 +1350,7 @@
           <w:color w:val="031522"/>
           <w:sz w:val="22"/>
         </w:rPr>
-        <w:t>Filtered bulk extract — not every column, every year. Open formats: CSV, JSON, Parquet. Schema travels with the file: grant number, program area, amount, awardee.</w:t>
+        <w:t>Open formats — CSV, JSON, Parquet. Schema travels with the file: grant number, program area, amount, awardee.</w:t>
       </w:r>
     </w:p>
     <w:p>
@@ -1527,7 +1392,7 @@
           <w:color w:val="031522"/>
           <w:sz w:val="22"/>
         </w:rPr>
-        <w:t>Export history — who, what, filter, row count. Continuous authorization, not a static password file.</w:t>
+        <w:t>Who, what, filter, row count. Continuous authorization — not a static password file.</w:t>
       </w:r>
     </w:p>
     <w:p>
@@ -1569,37 +1434,7 @@
           <w:color w:val="031522"/>
           <w:sz w:val="22"/>
         </w:rPr>
-        <w:t>Execute live Statement API call — that is the documented SQL REST contract. Short-lived token, same warehouse this dashboard uses. That is what Advana or Cloud One would call. It is not a vendor-only extract and it is not a fictional host.</w:t>
-      </w:r>
-    </w:p>
-    <w:p>
-      <w:pPr>
-        <w:spacing w:after="160" w:before="0" w:line="276" w:lineRule="auto"/>
-      </w:pPr>
-      <w:r>
-        <w:rPr>
-          <w:rFonts w:ascii="Calibri" w:hAnsi="Calibri"/>
-          <w:b w:val="0"/>
-          <w:i w:val="0"/>
-          <w:color w:val="031522"/>
-          <w:sz w:val="22"/>
-        </w:rPr>
-        <w:t>Strategic prompt (c) — Zero Trust and IL5.</w:t>
-      </w:r>
-    </w:p>
-    <w:p>
-      <w:pPr>
-        <w:spacing w:after="160" w:before="0" w:line="276" w:lineRule="auto"/>
-      </w:pPr>
-      <w:r>
-        <w:rPr>
-          <w:rFonts w:ascii="Calibri" w:hAnsi="Calibri"/>
-          <w:b w:val="0"/>
-          <w:i w:val="0"/>
-          <w:color w:val="031522"/>
-          <w:sz w:val="22"/>
-        </w:rPr>
-        <w:t>Three planes, same identity. The application has its own service principal; it does not borrow mine. The warehouse and the cluster are separate compute — micro-segmentation at the control plane. The catalog is the data-plane firewall. Least privilege: analysts read gold, they never see bronze. This cell is unclassified mock on commercial AWS — FedRAMP Moderate. The IL5 production cell is GovCloud, PrivateLink, customer-managed keys, continuous compliance against the same least-privilege grants. We are not claiming this POC is IL5.</w:t>
+        <w:t>That’s the documented SQL REST contract. Short-lived token, same warehouse this dashboard uses. That’s what Advana or Cloud One would call. Not a vendor-only extract, not a fictional host. And that’s prompt (c), Zero Trust and IL5. Three planes, same identity. The application has its own service principal; it doesn’t borrow mine. Warehouse and cluster are separate compute — micro-segmentation at the control plane. The catalog is the data-plane firewall. Least privilege: analysts read gold, they never see bronze. This cell is unclassified mock on commercial AWS, FedRAMP Moderate. The IL5 production cell is GovCloud, PrivateLink, customer-managed keys, continuous compliance against the same least-privilege grants. We’re not claiming this POC is IL5.</w:t>
       </w:r>
     </w:p>
     <w:p>

</xml_diff>

<commit_message>
Spell out the Compass speaker script for a live, non-Databricks audience
Expand every acronym, drop product jargon, and keep the walkthrough word-for-word so it can be read as a live demo.
</commit_message>
<xml_diff>
--- a/ONR_ITSS_Databricks_Speaker_Script.docx
+++ b/ONR_ITSS_Databricks_Speaker_Script.docx
@@ -285,7 +285,7 @@
           <w:color w:val="031522"/>
           <w:sz w:val="22"/>
         </w:rPr>
-        <w:t>This is Project Compass — Code 08’s portfolio console. Four hundred synthetic grants, about four hundred thirty-seven million dollars. All mock. No CUI, no PII, nothing classified. Let me show you the estate real quick, then we’ll take a file.</w:t>
+        <w:t>This is Project Compass, the Code 08 portfolio console. Four hundred synthetic grants, about four hundred thirty-seven million dollars. Everything you’re looking at is mock data. No Controlled Unclassified Information, no personally identifiable information, nothing classified. Let me show you what’s actually running, then we’ll take a file.</w:t>
       </w:r>
     </w:p>
     <w:p>
@@ -372,7 +372,7 @@
           <w:color w:val="031522"/>
           <w:sz w:val="22"/>
         </w:rPr>
-        <w:t>This is the live estate. Warehouse this console runs on, cluster that scores the models, file-arrival job left paused. That’s Element two — infrastructure defined in Git, showing up here as inventory. Let’s take the grants file.</w:t>
+        <w:t>This is what’s live. The query engine this console uses, the compute that scores the models, and a file-arrival job we left paused so nothing new lands while we’re talking. That’s Element two. The infrastructure is defined in version control, and this page is just the inventory of what’s running. Let’s take the grants file.</w:t>
       </w:r>
     </w:p>
     <w:p>
@@ -432,7 +432,7 @@
           <w:color w:val="031522"/>
           <w:sz w:val="22"/>
         </w:rPr>
-        <w:t>Element three is data operations. A grants file showed up. I’m not recoding a pipeline to take it. Inbound grants is the good file. Quarantine sample is the three bad rows — empty grant number, negative amount, and a duplicate. I’ll take both so you can see publish and hold in the same pass.</w:t>
+        <w:t>Element three is data operations. A grants file showed up. I’m not recoding a pipeline to take it. Inbound grants is the good file. Quarantine sample is the three bad rows: empty grant number, negative amount, and a duplicate. I’ll take both so you can see publish and hold in the same pass.</w:t>
       </w:r>
     </w:p>
     <w:p>
@@ -474,7 +474,7 @@
           <w:color w:val="031522"/>
           <w:sz w:val="22"/>
         </w:rPr>
-        <w:t>While that’s landing — this is prompt (a), the legacy footprint. We’re not cutting over the D-and-A Portal, the reporting stack, or the existing ETL this weekend. Strangler-fig. New files go to a governed landing zone. This button and the file-arrival path I’m about to start both write the same bronze table. Legacy reports keep reading the serving layer over a standard connection. When a report’s ready to retire, we point it at the table this console already uses. Rollback is delete-the-batch, not rewrite-the-estate.</w:t>
+        <w:t>While that’s landing, this is prompt (a), the legacy footprint. We’re not cutting over the D-and-A Portal, the reporting stack, or the existing extract, transform, and load jobs this weekend. We wrap the old system instead of ripping it out. New files go to a governed landing zone. This button, and the file-arrival path I’m about to start, both write the same landing table. Legacy reports keep reading the serving layer over a standard connection. When a report is ready to retire, we point it at the table this console already uses. Rollback means we delete that batch. We don’t rebuild the whole environment.</w:t>
       </w:r>
     </w:p>
     <w:p>
@@ -516,7 +516,7 @@
           <w:color w:val="031522"/>
           <w:sz w:val="22"/>
         </w:rPr>
-        <w:t>There it is. Eight published. Those three never entered landing — they’re held. Empty, dup, amt. One of the live grants went through with a warning, missing abstract. Quality tab’s there if you want the scoreboard. We don’t need it.</w:t>
+        <w:t>There it is. Eight rows published. Those three never entered the landing table. They’re held: empty grant number, duplicate, and a bad amount. One of the live grants went through with a warning because the abstract is missing. The Quality tab is there if you want the scoreboard. We don’t need it for this.</w:t>
       </w:r>
     </w:p>
     <w:p>
@@ -531,7 +531,7 @@
           <w:color w:val="031522"/>
           <w:sz w:val="22"/>
         </w:rPr>
-        <w:t>Same Element three. That was the warehouse path. Next is file arrival. I’m staying right here.</w:t>
+        <w:t>Same Element three. That was the query path. Next is file arrival, as if the file just showed up on its own. I’m staying right here.</w:t>
       </w:r>
     </w:p>
     <w:p>
@@ -573,7 +573,7 @@
           <w:color w:val="031522"/>
           <w:sz w:val="22"/>
         </w:rPr>
-        <w:t>Console just dropped a new file into the landing zone and loaded it into the same bronze table. That’s file-arrival, not a scheduled batch. Open stream notebook is there if you want the job. We’re not waiting on a cold start.</w:t>
+        <w:t>The console just dropped a new file into the landing zone and loaded it into the same landing table. That’s file arrival, not a scheduled batch. If you want to see the job behind it, that open-notebook control is right there. We’re not waiting on a cold start.</w:t>
       </w:r>
     </w:p>
     <w:p>
@@ -615,7 +615,7 @@
           <w:color w:val="031522"/>
           <w:sz w:val="22"/>
         </w:rPr>
-        <w:t>Bronze ticks. Silver — the trusted table — stays at four hundred and eight. It dedupes on grant number, so we don’t double-count the same award.</w:t>
+        <w:t>The landing count just moved. The trusted table stays at four hundred and eight because it de-duplicates on grant number, so we don’t count the same award twice.</w:t>
       </w:r>
     </w:p>
     <w:p>
@@ -630,7 +630,7 @@
           <w:color w:val="031522"/>
           <w:sz w:val="22"/>
         </w:rPr>
-        <w:t>That’s also prompt (d), disaster recovery. Contract is RPO fifteen minutes on the serving layer, essentially zero on landing, because the file’s still sitting in object storage. Time travel is the row-level RPO — baseline versus now. We’re not restoring on camera. RTO thirty minutes to serving gold, about five to serving the app. Annual DR is non-disruptive: pause file-arrival, restore yesterday’s gold into a side catalog, point a clone of the console at it, validate, tear down. Let’s look at lineage on those eight.</w:t>
+        <w:t>That’s also prompt (d), disaster recovery. Recovery point objective is fifteen minutes on the serving layer, and essentially zero on landing, because the file is still sitting in object storage. Time travel lets us compare the baseline snapshot to right now, row by row. We’re not restoring on camera. Recovery time objective is thirty minutes to serving data, about five minutes to serving this console. Annual disaster recovery is non-disruptive: we pause file arrival, restore yesterday’s serving data into a side environment, point a copy of the console at it, validate, and tear it down. Let’s look at lineage on those eight.</w:t>
       </w:r>
     </w:p>
     <w:p>
@@ -690,7 +690,7 @@
           <w:color w:val="031522"/>
           <w:sz w:val="22"/>
         </w:rPr>
-        <w:t>Element four is governance. I want you to see the graph, not a picture we drew in this console.</w:t>
+        <w:t>Element four is governance. I want you to see the real lineage graph, not a picture we drew in this console.</w:t>
       </w:r>
     </w:p>
     <w:p>
@@ -732,7 +732,7 @@
           <w:color w:val="031522"/>
           <w:sz w:val="22"/>
         </w:rPr>
-        <w:t>That’s the catalog’s own graph. Landing, bronze, silver, gold, this console. That’s the Element four visual. This screen is the operator surface, not the system of record.</w:t>
+        <w:t>That’s the catalog’s own graph. Landing, to the raw table, to the trusted table, to the serving layer, to this console. That’s the Element four visual. This screen is the operator view, not the system of record.</w:t>
       </w:r>
     </w:p>
     <w:p>
@@ -774,7 +774,7 @@
           <w:color w:val="031522"/>
           <w:sz w:val="22"/>
         </w:rPr>
-        <w:t>Four schemas. The eight we just took in are already registered. Source file, ingest time, tags — on the table, not in a spreadsheet.</w:t>
+        <w:t>Four layers. The eight we just took in are already registered. Source file, ingest time, tags — on the table, not in a spreadsheet.</w:t>
       </w:r>
     </w:p>
     <w:p>
@@ -816,7 +816,7 @@
           <w:color w:val="031522"/>
           <w:sz w:val="22"/>
         </w:rPr>
-        <w:t>Completeness, accuracy, consistency, timeliness. If a vendor feed lapses, you see it here as a timeliness drop — not a blank dashboard.</w:t>
+        <w:t>Completeness, accuracy, consistency, timeliness. If a vendor feed lapses, you see it here as a timeliness drop, not a blank dashboard.</w:t>
       </w:r>
     </w:p>
     <w:p>
@@ -858,7 +858,7 @@
           <w:color w:val="031522"/>
           <w:sz w:val="22"/>
         </w:rPr>
-        <w:t>And that’s prompt (e), vendor and lifecycle. Every external feed is a licensed product — owner, renewal date, quality SLO. Today the tags are data_source, domain, data_sensitivity. In production we add vendor, license_id, renewal_date. Usage is metered on every search and every export. If a subscription stops, nothing new lands. Last-good gold stays. We don’t auto-delete. Let’s score what we just took in.</w:t>
+        <w:t>And that’s prompt (e), vendor and lifecycle. Every external feed is a licensed product: owner, renewal date, and a quality service level. Today the tags are data source, domain, and data sensitivity. In production we add vendor, license identifier, and renewal date. Usage is metered on every search and every export. If a subscription stops, nothing new lands. The last good serving data stays. We don’t auto-delete. Let’s score what we just took in.</w:t>
       </w:r>
     </w:p>
     <w:p>
@@ -918,7 +918,7 @@
           <w:color w:val="031522"/>
           <w:sz w:val="22"/>
         </w:rPr>
-        <w:t>Element five is decision support. Models were trained last night and registered in the catalog. I’m not retraining. I’m scoring the portfolio we just ingested — including those eight.</w:t>
+        <w:t>Element five is decision support. The models were trained last night and registered in the catalog. I’m not retraining. I’m scoring the portfolio we just ingested, including those eight.</w:t>
       </w:r>
     </w:p>
     <w:p>
@@ -960,7 +960,7 @@
           <w:color w:val="031522"/>
           <w:sz w:val="22"/>
         </w:rPr>
-        <w:t>That button scores from models already in the catalog. It doesn’t train. While it runs — this is prompt (b), financial and budgetary integration. Execution is a first-class feed. Twelve hundred ERP lines: budget, actual, execution rate. Three models, all on this same portfolio, not a second dataset.</w:t>
+        <w:t>That button scores from models already in the catalog. It doesn’t train. While it runs, this is prompt (b), financial and budgetary integration. Execution is a first-class feed. Twelve hundred financial lines from the enterprise system: budget, actual, and execution rate. Three models, all on this same portfolio, not a second dataset.</w:t>
       </w:r>
     </w:p>
     <w:p>
@@ -975,7 +975,7 @@
           <w:color w:val="031522"/>
           <w:sz w:val="22"/>
         </w:rPr>
-        <w:t>Descriptive is the page a resource officer actually opens — dollars, execution, ON_TARGET, WARNING, AT_RISK. That’s Portfolio, next.</w:t>
+        <w:t>Descriptive is the page a resource officer actually opens: dollars, execution, on target, warning, and at risk. That’s Portfolio, next.</w:t>
       </w:r>
     </w:p>
     <w:p>
@@ -990,7 +990,7 @@
           <w:color w:val="031522"/>
           <w:sz w:val="22"/>
         </w:rPr>
-        <w:t>Predictive: a Random Forest that returns Fund, Review, or Defer on large awards. An IsolationForest for budget spike, execution collapse, and low-return concentration. And ordinary least squares — two-year horizon, ninety-five percent band, TREND-ACCEL, TREND-STEADY, TREND-DECLINE. That’s OLS, not Prophet.</w:t>
+        <w:t>Predictive: a random forest that returns Fund, Review, or Defer on large awards. An isolation forest for budget spike, execution collapse, and low-return concentration. And ordinary least squares: two-year horizon, ninety-five percent band, trend accelerating, trend steady, and trend declining. That’s ordinary least squares, not a neural net.</w:t>
       </w:r>
     </w:p>
     <w:p>
@@ -1005,7 +1005,7 @@
           <w:color w:val="031522"/>
           <w:sz w:val="22"/>
         </w:rPr>
-        <w:t>Prescriptive: protect ON_TARGET, move dollars off AT_RISK and TREND-DECLINE, review large-award concentration. Engineer owns landing and trusted. Scientist owns the registered models. Analyst owns the serving layer and the daily brief. Same catalog.</w:t>
+        <w:t>Prescriptive: protect on-target work, move dollars off at-risk and trend-declining programs, and review large-award concentration. The engineer owns landing and trusted data. The scientist owns the registered models. The analyst owns the serving layer and the daily brief. Same catalog.</w:t>
       </w:r>
     </w:p>
     <w:p>
@@ -1047,7 +1047,7 @@
           <w:color w:val="031522"/>
           <w:sz w:val="22"/>
         </w:rPr>
-        <w:t>That’s feature and score mix versus the baseline snapshot — not a fake accuracy drop. The live grants moved the mix.</w:t>
+        <w:t>That’s feature mix and score mix versus the baseline snapshot, not a fake accuracy drop. The live grants moved the mix.</w:t>
       </w:r>
     </w:p>
     <w:p>
@@ -1089,7 +1089,7 @@
           <w:color w:val="031522"/>
           <w:sz w:val="22"/>
         </w:rPr>
-        <w:t>Resource action is the sentence a resource officer would sign — Defer dollars off one area onto AT_RISK plus TREND-DECLINE. That declining program is the reallocation candidate. Let’s look at it the way they would.</w:t>
+        <w:t>Resource action is the sentence a resource officer would sign: defer dollars off one area onto at-risk plus trend-declining. That declining program is the reallocation candidate. Let’s look at it the way they would.</w:t>
       </w:r>
     </w:p>
     <w:p>
@@ -1149,7 +1149,7 @@
           <w:color w:val="031522"/>
           <w:sz w:val="22"/>
         </w:rPr>
-        <w:t>Element six — this is the officer view. Nobody here needs SQL. Active grants is still four hundred and eight.</w:t>
+        <w:t>Element six. This is the officer view. Nobody here needs to write a query. Active grants is still four hundred and eight.</w:t>
       </w:r>
     </w:p>
     <w:p>
@@ -1275,7 +1275,7 @@
           <w:color w:val="031522"/>
           <w:sz w:val="22"/>
         </w:rPr>
-        <w:t>Same serving layer the forecast used. AT_RISK plus TREND-DECLINE is the reallocation set. Last stop — get it out of here in an open format.</w:t>
+        <w:t>Same serving layer the forecast used. At-risk plus trend-declining is the reallocation set. Last stop: we get it out of here in an open format.</w:t>
       </w:r>
     </w:p>
     <w:p>
@@ -1308,7 +1308,7 @@
           <w:color w:val="031522"/>
           <w:sz w:val="22"/>
         </w:rPr>
-        <w:t>Element seven is interoperability. Filtered extract — not every column, every year.</w:t>
+        <w:t>Element seven is interoperability. Filtered extract, not every column, every year.</w:t>
       </w:r>
     </w:p>
     <w:p>
@@ -1350,7 +1350,7 @@
           <w:color w:val="031522"/>
           <w:sz w:val="22"/>
         </w:rPr>
-        <w:t>Open formats — CSV, JSON, Parquet. Schema travels with the file: grant number, program area, amount, awardee.</w:t>
+        <w:t>Open formats: comma-separated values, JSON, and Parquet. The column names travel with the file: grant number, program area, amount, awardee.</w:t>
       </w:r>
     </w:p>
     <w:p>
@@ -1392,7 +1392,7 @@
           <w:color w:val="031522"/>
           <w:sz w:val="22"/>
         </w:rPr>
-        <w:t>Who, what, filter, row count. Continuous authorization — not a static password file.</w:t>
+        <w:t>Who, what, filter, row count. Continuous authorization, not a static password file.</w:t>
       </w:r>
     </w:p>
     <w:p>
@@ -1434,7 +1434,7 @@
           <w:color w:val="031522"/>
           <w:sz w:val="22"/>
         </w:rPr>
-        <w:t>That’s the documented SQL REST contract. Short-lived token, same warehouse this dashboard uses. That’s what Advana or Cloud One would call. Not a vendor-only extract, not a fictional host. And that’s prompt (c), Zero Trust and IL5. Three planes, same identity. The application has its own service principal; it doesn’t borrow mine. Warehouse and cluster are separate compute — micro-segmentation at the control plane. The catalog is the data-plane firewall. Least privilege: analysts read gold, they never see bronze. This cell is unclassified mock on commercial AWS, FedRAMP Moderate. The IL5 production cell is GovCloud, PrivateLink, customer-managed keys, continuous compliance against the same least-privilege grants. We’re not claiming this POC is IL5.</w:t>
+        <w:t>That’s the documented query interface over the web. Short-lived token, same query engine this dashboard uses. That’s what Advana or Cloud One would call. Not a vendor-only extract, not a made-up host.</w:t>
       </w:r>
     </w:p>
     <w:p>
@@ -1449,7 +1449,22 @@
           <w:color w:val="031522"/>
           <w:sz w:val="22"/>
         </w:rPr>
-        <w:t>Tomorrow another file lands in the same landing zone. Same gold. Same registered models — we rescore from this console. Mock data only.</w:t>
+        <w:t>And that’s prompt (c), Zero Trust and Impact Level 5. Three planes, same identity. This application has its own service identity; it doesn’t borrow mine. The query engine and the scoring compute are separate. That’s micro-segmentation at the control plane. The catalog is the data-plane firewall. Least privilege: analysts read the serving layer, they never see the landing data. This cell is unclassified mock data on commercial Amazon Web Services at the FedRAMP Moderate baseline. The Impact Level 5 production cell is government cloud, private connectivity, customer-managed keys, and continuous compliance against the same least-privilege grants. We’re not claiming this proof of concept is Impact Level 5.</w:t>
+      </w:r>
+    </w:p>
+    <w:p>
+      <w:pPr>
+        <w:spacing w:after="160" w:before="0" w:line="276" w:lineRule="auto"/>
+      </w:pPr>
+      <w:r>
+        <w:rPr>
+          <w:rFonts w:ascii="Calibri" w:hAnsi="Calibri"/>
+          <w:b w:val="0"/>
+          <w:i w:val="0"/>
+          <w:color w:val="031522"/>
+          <w:sz w:val="22"/>
+        </w:rPr>
+        <w:t>Tomorrow another file lands in the same landing zone. Same serving data. Same registered models. We rescore from this console. Mock data only.</w:t>
       </w:r>
     </w:p>
     <w:p>

</xml_diff>